<commit_message>
docs: actualizando documento word <Co-authored-by-MarioSuero>
</commit_message>
<xml_diff>
--- a/docs/Proyecto final de programacion paralela.docx
+++ b/docs/Proyecto final de programacion paralela.docx
@@ -171,6 +171,7 @@
                 <w:bCs/>
                 <w:sz w:val="24"/>
                 <w:szCs w:val="24"/>
+                <w:lang w:val="es-DO"/>
               </w:rPr>
             </w:pPr>
             <w:r>
@@ -180,6 +181,7 @@
                 <w:bCs/>
                 <w:sz w:val="24"/>
                 <w:szCs w:val="24"/>
+                <w:lang w:val="es-DO"/>
               </w:rPr>
               <w:t>PROYECTO FINAL</w:t>
             </w:r>
@@ -689,7 +691,7 @@
       <w:sdtContent>
         <w:p>
           <w:pPr>
-            <w:pStyle w:val="TtuloTDC"/>
+            <w:pStyle w:val="TOCHeading"/>
             <w:spacing w:line="360" w:lineRule="auto"/>
             <w:rPr>
               <w:b/>
@@ -708,16 +710,15 @@
         </w:p>
         <w:p>
           <w:pPr>
-            <w:pStyle w:val="TDC1"/>
+            <w:pStyle w:val="TOC1"/>
             <w:tabs>
-              <w:tab w:val="right" w:leader="dot" w:pos="9408"/>
+              <w:tab w:val="right" w:leader="dot" w:pos="10070"/>
             </w:tabs>
             <w:rPr>
               <w:noProof/>
               <w:kern w:val="2"/>
               <w:sz w:val="24"/>
               <w:szCs w:val="24"/>
-              <w:lang w:val="es-ES" w:eastAsia="es-ES"/>
               <w14:ligatures w14:val="standardContextual"/>
             </w:rPr>
           </w:pPr>
@@ -730,14 +731,15 @@
           <w:r>
             <w:fldChar w:fldCharType="separate"/>
           </w:r>
-          <w:hyperlink w:anchor="_Toc236754154" w:history="1">
-            <w:r>
-              <w:rPr>
-                <w:rStyle w:val="Hipervnculo"/>
+          <w:hyperlink w:anchor="_Toc236761869" w:history="1">
+            <w:r>
+              <w:rPr>
+                <w:rStyle w:val="Hyperlink"/>
                 <w:rFonts w:ascii="Arial" w:hAnsi="Arial" w:cs="Arial"/>
                 <w:b/>
                 <w:bCs/>
                 <w:noProof/>
+                <w:lang w:val="es-DO"/>
               </w:rPr>
               <w:t>1. INTRODUCCIÓN</w:t>
             </w:r>
@@ -760,7 +762,7 @@
                 <w:noProof/>
                 <w:webHidden/>
               </w:rPr>
-              <w:instrText xml:space="preserve"> PAGEREF _Toc236754154 \h </w:instrText>
+              <w:instrText xml:space="preserve"> PAGEREF _Toc236761869 \h </w:instrText>
             </w:r>
             <w:r>
               <w:rPr>
@@ -780,7 +782,7 @@
                 <w:noProof/>
                 <w:webHidden/>
               </w:rPr>
-              <w:t>3</w:t>
+              <w:t>4</w:t>
             </w:r>
             <w:r>
               <w:rPr>
@@ -793,23 +795,22 @@
         </w:p>
         <w:p>
           <w:pPr>
-            <w:pStyle w:val="TDC2"/>
+            <w:pStyle w:val="TOC2"/>
             <w:tabs>
-              <w:tab w:val="right" w:leader="dot" w:pos="9408"/>
+              <w:tab w:val="right" w:leader="dot" w:pos="10070"/>
             </w:tabs>
             <w:rPr>
               <w:noProof/>
               <w:kern w:val="2"/>
               <w:sz w:val="24"/>
               <w:szCs w:val="24"/>
-              <w:lang w:val="es-ES" w:eastAsia="es-ES"/>
               <w14:ligatures w14:val="standardContextual"/>
             </w:rPr>
           </w:pPr>
-          <w:hyperlink w:anchor="_Toc236754155" w:history="1">
-            <w:r>
-              <w:rPr>
-                <w:rStyle w:val="Hipervnculo"/>
+          <w:hyperlink w:anchor="_Toc236761870" w:history="1">
+            <w:r>
+              <w:rPr>
+                <w:rStyle w:val="Hyperlink"/>
                 <w:rFonts w:ascii="Arial" w:hAnsi="Arial" w:cs="Arial"/>
                 <w:b/>
                 <w:bCs/>
@@ -837,7 +838,7 @@
                 <w:noProof/>
                 <w:webHidden/>
               </w:rPr>
-              <w:instrText xml:space="preserve"> PAGEREF _Toc236754155 \h </w:instrText>
+              <w:instrText xml:space="preserve"> PAGEREF _Toc236761870 \h </w:instrText>
             </w:r>
             <w:r>
               <w:rPr>
@@ -857,7 +858,7 @@
                 <w:noProof/>
                 <w:webHidden/>
               </w:rPr>
-              <w:t>3</w:t>
+              <w:t>4</w:t>
             </w:r>
             <w:r>
               <w:rPr>
@@ -870,23 +871,22 @@
         </w:p>
         <w:p>
           <w:pPr>
-            <w:pStyle w:val="TDC2"/>
+            <w:pStyle w:val="TOC2"/>
             <w:tabs>
-              <w:tab w:val="right" w:leader="dot" w:pos="9408"/>
+              <w:tab w:val="right" w:leader="dot" w:pos="10070"/>
             </w:tabs>
             <w:rPr>
               <w:noProof/>
               <w:kern w:val="2"/>
               <w:sz w:val="24"/>
               <w:szCs w:val="24"/>
-              <w:lang w:val="es-ES" w:eastAsia="es-ES"/>
               <w14:ligatures w14:val="standardContextual"/>
             </w:rPr>
           </w:pPr>
-          <w:hyperlink w:anchor="_Toc236754156" w:history="1">
-            <w:r>
-              <w:rPr>
-                <w:rStyle w:val="Hipervnculo"/>
+          <w:hyperlink w:anchor="_Toc236761871" w:history="1">
+            <w:r>
+              <w:rPr>
+                <w:rStyle w:val="Hyperlink"/>
                 <w:rFonts w:ascii="Arial" w:hAnsi="Arial" w:cs="Arial"/>
                 <w:b/>
                 <w:bCs/>
@@ -914,7 +914,7 @@
                 <w:noProof/>
                 <w:webHidden/>
               </w:rPr>
-              <w:instrText xml:space="preserve"> PAGEREF _Toc236754156 \h </w:instrText>
+              <w:instrText xml:space="preserve"> PAGEREF _Toc236761871 \h </w:instrText>
             </w:r>
             <w:r>
               <w:rPr>
@@ -934,7 +934,7 @@
                 <w:noProof/>
                 <w:webHidden/>
               </w:rPr>
-              <w:t>3</w:t>
+              <w:t>4</w:t>
             </w:r>
             <w:r>
               <w:rPr>
@@ -947,23 +947,22 @@
         </w:p>
         <w:p>
           <w:pPr>
-            <w:pStyle w:val="TDC2"/>
+            <w:pStyle w:val="TOC2"/>
             <w:tabs>
-              <w:tab w:val="right" w:leader="dot" w:pos="9408"/>
+              <w:tab w:val="right" w:leader="dot" w:pos="10070"/>
             </w:tabs>
             <w:rPr>
               <w:noProof/>
               <w:kern w:val="2"/>
               <w:sz w:val="24"/>
               <w:szCs w:val="24"/>
-              <w:lang w:val="es-ES" w:eastAsia="es-ES"/>
               <w14:ligatures w14:val="standardContextual"/>
             </w:rPr>
           </w:pPr>
-          <w:hyperlink w:anchor="_Toc236754157" w:history="1">
-            <w:r>
-              <w:rPr>
-                <w:rStyle w:val="Hipervnculo"/>
+          <w:hyperlink w:anchor="_Toc236761872" w:history="1">
+            <w:r>
+              <w:rPr>
+                <w:rStyle w:val="Hyperlink"/>
                 <w:rFonts w:ascii="Arial" w:hAnsi="Arial" w:cs="Arial"/>
                 <w:b/>
                 <w:bCs/>
@@ -991,7 +990,7 @@
                 <w:noProof/>
                 <w:webHidden/>
               </w:rPr>
-              <w:instrText xml:space="preserve"> PAGEREF _Toc236754157 \h </w:instrText>
+              <w:instrText xml:space="preserve"> PAGEREF _Toc236761872 \h </w:instrText>
             </w:r>
             <w:r>
               <w:rPr>
@@ -1011,7 +1010,7 @@
                 <w:noProof/>
                 <w:webHidden/>
               </w:rPr>
-              <w:t>3</w:t>
+              <w:t>4</w:t>
             </w:r>
             <w:r>
               <w:rPr>
@@ -1024,23 +1023,22 @@
         </w:p>
         <w:p>
           <w:pPr>
-            <w:pStyle w:val="TDC3"/>
+            <w:pStyle w:val="TOC3"/>
             <w:tabs>
-              <w:tab w:val="right" w:leader="dot" w:pos="9408"/>
+              <w:tab w:val="right" w:leader="dot" w:pos="10070"/>
             </w:tabs>
             <w:rPr>
               <w:noProof/>
               <w:kern w:val="2"/>
               <w:sz w:val="24"/>
               <w:szCs w:val="24"/>
-              <w:lang w:val="es-ES" w:eastAsia="es-ES"/>
               <w14:ligatures w14:val="standardContextual"/>
             </w:rPr>
           </w:pPr>
-          <w:hyperlink w:anchor="_Toc236754158" w:history="1">
-            <w:r>
-              <w:rPr>
-                <w:rStyle w:val="Hipervnculo"/>
+          <w:hyperlink w:anchor="_Toc236761873" w:history="1">
+            <w:r>
+              <w:rPr>
+                <w:rStyle w:val="Hyperlink"/>
                 <w:rFonts w:ascii="Arial" w:hAnsi="Arial" w:cs="Arial"/>
                 <w:b/>
                 <w:bCs/>
@@ -1068,7 +1066,7 @@
                 <w:noProof/>
                 <w:webHidden/>
               </w:rPr>
-              <w:instrText xml:space="preserve"> PAGEREF _Toc236754158 \h </w:instrText>
+              <w:instrText xml:space="preserve"> PAGEREF _Toc236761873 \h </w:instrText>
             </w:r>
             <w:r>
               <w:rPr>
@@ -1088,7 +1086,7 @@
                 <w:noProof/>
                 <w:webHidden/>
               </w:rPr>
-              <w:t>3</w:t>
+              <w:t>4</w:t>
             </w:r>
             <w:r>
               <w:rPr>
@@ -1101,23 +1099,22 @@
         </w:p>
         <w:p>
           <w:pPr>
-            <w:pStyle w:val="TDC3"/>
+            <w:pStyle w:val="TOC3"/>
             <w:tabs>
-              <w:tab w:val="right" w:leader="dot" w:pos="9408"/>
+              <w:tab w:val="right" w:leader="dot" w:pos="10070"/>
             </w:tabs>
             <w:rPr>
               <w:noProof/>
               <w:kern w:val="2"/>
               <w:sz w:val="24"/>
               <w:szCs w:val="24"/>
-              <w:lang w:val="es-ES" w:eastAsia="es-ES"/>
               <w14:ligatures w14:val="standardContextual"/>
             </w:rPr>
           </w:pPr>
-          <w:hyperlink w:anchor="_Toc236754159" w:history="1">
-            <w:r>
-              <w:rPr>
-                <w:rStyle w:val="Hipervnculo"/>
+          <w:hyperlink w:anchor="_Toc236761874" w:history="1">
+            <w:r>
+              <w:rPr>
+                <w:rStyle w:val="Hyperlink"/>
                 <w:rFonts w:ascii="Arial" w:hAnsi="Arial" w:cs="Arial"/>
                 <w:b/>
                 <w:bCs/>
@@ -1144,7 +1141,7 @@
                 <w:noProof/>
                 <w:webHidden/>
               </w:rPr>
-              <w:instrText xml:space="preserve"> PAGEREF _Toc236754159 \h </w:instrText>
+              <w:instrText xml:space="preserve"> PAGEREF _Toc236761874 \h </w:instrText>
             </w:r>
             <w:r>
               <w:rPr>
@@ -1164,7 +1161,7 @@
                 <w:noProof/>
                 <w:webHidden/>
               </w:rPr>
-              <w:t>4</w:t>
+              <w:t>5</w:t>
             </w:r>
             <w:r>
               <w:rPr>
@@ -1177,23 +1174,22 @@
         </w:p>
         <w:p>
           <w:pPr>
-            <w:pStyle w:val="TDC1"/>
+            <w:pStyle w:val="TOC1"/>
             <w:tabs>
-              <w:tab w:val="right" w:leader="dot" w:pos="9408"/>
+              <w:tab w:val="right" w:leader="dot" w:pos="10070"/>
             </w:tabs>
             <w:rPr>
               <w:noProof/>
               <w:kern w:val="2"/>
               <w:sz w:val="24"/>
               <w:szCs w:val="24"/>
-              <w:lang w:val="es-ES" w:eastAsia="es-ES"/>
               <w14:ligatures w14:val="standardContextual"/>
             </w:rPr>
           </w:pPr>
-          <w:hyperlink w:anchor="_Toc236754160" w:history="1">
-            <w:r>
-              <w:rPr>
-                <w:rStyle w:val="Hipervnculo"/>
+          <w:hyperlink w:anchor="_Toc236761875" w:history="1">
+            <w:r>
+              <w:rPr>
+                <w:rStyle w:val="Hyperlink"/>
                 <w:rFonts w:ascii="Arial" w:hAnsi="Arial" w:cs="Arial"/>
                 <w:b/>
                 <w:bCs/>
@@ -1221,7 +1217,7 @@
                 <w:noProof/>
                 <w:webHidden/>
               </w:rPr>
-              <w:instrText xml:space="preserve"> PAGEREF _Toc236754160 \h </w:instrText>
+              <w:instrText xml:space="preserve"> PAGEREF _Toc236761875 \h </w:instrText>
             </w:r>
             <w:r>
               <w:rPr>
@@ -1241,7 +1237,7 @@
                 <w:noProof/>
                 <w:webHidden/>
               </w:rPr>
-              <w:t>4</w:t>
+              <w:t>5</w:t>
             </w:r>
             <w:r>
               <w:rPr>
@@ -1254,40 +1250,29 @@
         </w:p>
         <w:p>
           <w:pPr>
-            <w:pStyle w:val="TDC1"/>
+            <w:pStyle w:val="TOC1"/>
             <w:tabs>
-              <w:tab w:val="right" w:leader="dot" w:pos="9408"/>
+              <w:tab w:val="right" w:leader="dot" w:pos="10070"/>
             </w:tabs>
             <w:rPr>
               <w:noProof/>
               <w:kern w:val="2"/>
               <w:sz w:val="24"/>
               <w:szCs w:val="24"/>
-              <w:lang w:val="es-ES" w:eastAsia="es-ES"/>
               <w14:ligatures w14:val="standardContextual"/>
             </w:rPr>
           </w:pPr>
-          <w:hyperlink w:anchor="_Toc236754161" w:history="1">
-            <w:r>
-              <w:rPr>
-                <w:rStyle w:val="Hipervnculo"/>
+          <w:hyperlink w:anchor="_Toc236761876" w:history="1">
+            <w:r>
+              <w:rPr>
+                <w:rStyle w:val="Hyperlink"/>
                 <w:rFonts w:ascii="Arial" w:hAnsi="Arial" w:cs="Arial"/>
                 <w:b/>
                 <w:bCs/>
                 <w:noProof/>
                 <w:lang w:val="es-DO"/>
               </w:rPr>
-              <w:t xml:space="preserve">2.1 </w:t>
-            </w:r>
-            <w:r>
-              <w:rPr>
-                <w:rStyle w:val="Hipervnculo"/>
-                <w:rFonts w:ascii="Arial" w:hAnsi="Arial" w:cs="Arial"/>
-                <w:b/>
-                <w:bCs/>
-                <w:noProof/>
-              </w:rPr>
-              <w:t>Contexto del Problema Seleccionado</w:t>
+              <w:t>2.1 Contexto del Problema Seleccionado</w:t>
             </w:r>
             <w:r>
               <w:rPr>
@@ -1308,7 +1293,7 @@
                 <w:noProof/>
                 <w:webHidden/>
               </w:rPr>
-              <w:instrText xml:space="preserve"> PAGEREF _Toc236754161 \h </w:instrText>
+              <w:instrText xml:space="preserve"> PAGEREF _Toc236761876 \h </w:instrText>
             </w:r>
             <w:r>
               <w:rPr>
@@ -1328,7 +1313,7 @@
                 <w:noProof/>
                 <w:webHidden/>
               </w:rPr>
-              <w:t>4</w:t>
+              <w:t>5</w:t>
             </w:r>
             <w:r>
               <w:rPr>
@@ -1341,27 +1326,27 @@
         </w:p>
         <w:p>
           <w:pPr>
-            <w:pStyle w:val="TDC1"/>
+            <w:pStyle w:val="TOC1"/>
             <w:tabs>
-              <w:tab w:val="right" w:leader="dot" w:pos="9408"/>
+              <w:tab w:val="right" w:leader="dot" w:pos="10070"/>
             </w:tabs>
             <w:rPr>
               <w:noProof/>
               <w:kern w:val="2"/>
               <w:sz w:val="24"/>
               <w:szCs w:val="24"/>
-              <w:lang w:val="es-ES" w:eastAsia="es-ES"/>
               <w14:ligatures w14:val="standardContextual"/>
             </w:rPr>
           </w:pPr>
-          <w:hyperlink w:anchor="_Toc236754162" w:history="1">
-            <w:r>
-              <w:rPr>
-                <w:rStyle w:val="Hipervnculo"/>
+          <w:hyperlink w:anchor="_Toc236761877" w:history="1">
+            <w:r>
+              <w:rPr>
+                <w:rStyle w:val="Hyperlink"/>
                 <w:rFonts w:ascii="Arial" w:hAnsi="Arial" w:cs="Arial"/>
                 <w:b/>
                 <w:bCs/>
                 <w:noProof/>
+                <w:lang w:val="es-DO"/>
               </w:rPr>
               <w:t>2.2 Aplicación del Problema en un Escenario Real</w:t>
             </w:r>
@@ -1384,7 +1369,7 @@
                 <w:noProof/>
                 <w:webHidden/>
               </w:rPr>
-              <w:instrText xml:space="preserve"> PAGEREF _Toc236754162 \h </w:instrText>
+              <w:instrText xml:space="preserve"> PAGEREF _Toc236761877 \h </w:instrText>
             </w:r>
             <w:r>
               <w:rPr>
@@ -1404,7 +1389,7 @@
                 <w:noProof/>
                 <w:webHidden/>
               </w:rPr>
-              <w:t>4</w:t>
+              <w:t>5</w:t>
             </w:r>
             <w:r>
               <w:rPr>
@@ -1417,7 +1402,613 @@
         </w:p>
         <w:p>
           <w:pPr>
-            <w:pStyle w:val="TtuloTDC"/>
+            <w:pStyle w:val="TOC1"/>
+            <w:tabs>
+              <w:tab w:val="right" w:leader="dot" w:pos="10070"/>
+            </w:tabs>
+            <w:rPr>
+              <w:noProof/>
+              <w:kern w:val="2"/>
+              <w:sz w:val="24"/>
+              <w:szCs w:val="24"/>
+              <w14:ligatures w14:val="standardContextual"/>
+            </w:rPr>
+          </w:pPr>
+          <w:hyperlink w:anchor="_Toc236761878" w:history="1">
+            <w:r>
+              <w:rPr>
+                <w:rStyle w:val="Hyperlink"/>
+                <w:rFonts w:ascii="Arial" w:hAnsi="Arial" w:cs="Arial"/>
+                <w:b/>
+                <w:bCs/>
+                <w:noProof/>
+                <w:lang w:val="es-DO"/>
+              </w:rPr>
+              <w:t>2.3 Importancia del Paralelismo en la Solución</w:t>
+            </w:r>
+            <w:r>
+              <w:rPr>
+                <w:noProof/>
+                <w:webHidden/>
+              </w:rPr>
+              <w:tab/>
+            </w:r>
+            <w:r>
+              <w:rPr>
+                <w:noProof/>
+                <w:webHidden/>
+              </w:rPr>
+              <w:fldChar w:fldCharType="begin"/>
+            </w:r>
+            <w:r>
+              <w:rPr>
+                <w:noProof/>
+                <w:webHidden/>
+              </w:rPr>
+              <w:instrText xml:space="preserve"> PAGEREF _Toc236761878 \h </w:instrText>
+            </w:r>
+            <w:r>
+              <w:rPr>
+                <w:noProof/>
+                <w:webHidden/>
+              </w:rPr>
+            </w:r>
+            <w:r>
+              <w:rPr>
+                <w:noProof/>
+                <w:webHidden/>
+              </w:rPr>
+              <w:fldChar w:fldCharType="separate"/>
+            </w:r>
+            <w:r>
+              <w:rPr>
+                <w:noProof/>
+                <w:webHidden/>
+              </w:rPr>
+              <w:t>6</w:t>
+            </w:r>
+            <w:r>
+              <w:rPr>
+                <w:noProof/>
+                <w:webHidden/>
+              </w:rPr>
+              <w:fldChar w:fldCharType="end"/>
+            </w:r>
+          </w:hyperlink>
+        </w:p>
+        <w:p>
+          <w:pPr>
+            <w:pStyle w:val="TOC1"/>
+            <w:tabs>
+              <w:tab w:val="right" w:leader="dot" w:pos="10070"/>
+            </w:tabs>
+            <w:rPr>
+              <w:noProof/>
+              <w:kern w:val="2"/>
+              <w:sz w:val="24"/>
+              <w:szCs w:val="24"/>
+              <w14:ligatures w14:val="standardContextual"/>
+            </w:rPr>
+          </w:pPr>
+          <w:hyperlink w:anchor="_Toc236761879" w:history="1">
+            <w:r>
+              <w:rPr>
+                <w:rStyle w:val="Hyperlink"/>
+                <w:rFonts w:ascii="Arial" w:hAnsi="Arial" w:cs="Arial"/>
+                <w:b/>
+                <w:bCs/>
+                <w:noProof/>
+                <w:lang w:val="es-DO"/>
+              </w:rPr>
+              <w:t>3. CUMPLIMIENTO DE LOS REQUISITOS DEL PROYECTO</w:t>
+            </w:r>
+            <w:r>
+              <w:rPr>
+                <w:noProof/>
+                <w:webHidden/>
+              </w:rPr>
+              <w:tab/>
+            </w:r>
+            <w:r>
+              <w:rPr>
+                <w:noProof/>
+                <w:webHidden/>
+              </w:rPr>
+              <w:fldChar w:fldCharType="begin"/>
+            </w:r>
+            <w:r>
+              <w:rPr>
+                <w:noProof/>
+                <w:webHidden/>
+              </w:rPr>
+              <w:instrText xml:space="preserve"> PAGEREF _Toc236761879 \h </w:instrText>
+            </w:r>
+            <w:r>
+              <w:rPr>
+                <w:noProof/>
+                <w:webHidden/>
+              </w:rPr>
+            </w:r>
+            <w:r>
+              <w:rPr>
+                <w:noProof/>
+                <w:webHidden/>
+              </w:rPr>
+              <w:fldChar w:fldCharType="separate"/>
+            </w:r>
+            <w:r>
+              <w:rPr>
+                <w:noProof/>
+                <w:webHidden/>
+              </w:rPr>
+              <w:t>6</w:t>
+            </w:r>
+            <w:r>
+              <w:rPr>
+                <w:noProof/>
+                <w:webHidden/>
+              </w:rPr>
+              <w:fldChar w:fldCharType="end"/>
+            </w:r>
+          </w:hyperlink>
+        </w:p>
+        <w:p>
+          <w:pPr>
+            <w:pStyle w:val="TOC2"/>
+            <w:tabs>
+              <w:tab w:val="right" w:leader="dot" w:pos="10070"/>
+            </w:tabs>
+            <w:rPr>
+              <w:noProof/>
+              <w:kern w:val="2"/>
+              <w:sz w:val="24"/>
+              <w:szCs w:val="24"/>
+              <w14:ligatures w14:val="standardContextual"/>
+            </w:rPr>
+          </w:pPr>
+          <w:hyperlink w:anchor="_Toc236761880" w:history="1">
+            <w:r>
+              <w:rPr>
+                <w:rStyle w:val="Hyperlink"/>
+                <w:rFonts w:ascii="Arial" w:hAnsi="Arial" w:cs="Arial"/>
+                <w:b/>
+                <w:bCs/>
+                <w:noProof/>
+              </w:rPr>
+              <w:t>3.1 Ejecución Simultánea de Múltiples Tareas</w:t>
+            </w:r>
+            <w:r>
+              <w:rPr>
+                <w:noProof/>
+                <w:webHidden/>
+              </w:rPr>
+              <w:tab/>
+            </w:r>
+            <w:r>
+              <w:rPr>
+                <w:noProof/>
+                <w:webHidden/>
+              </w:rPr>
+              <w:fldChar w:fldCharType="begin"/>
+            </w:r>
+            <w:r>
+              <w:rPr>
+                <w:noProof/>
+                <w:webHidden/>
+              </w:rPr>
+              <w:instrText xml:space="preserve"> PAGEREF _Toc236761880 \h </w:instrText>
+            </w:r>
+            <w:r>
+              <w:rPr>
+                <w:noProof/>
+                <w:webHidden/>
+              </w:rPr>
+            </w:r>
+            <w:r>
+              <w:rPr>
+                <w:noProof/>
+                <w:webHidden/>
+              </w:rPr>
+              <w:fldChar w:fldCharType="separate"/>
+            </w:r>
+            <w:r>
+              <w:rPr>
+                <w:noProof/>
+                <w:webHidden/>
+              </w:rPr>
+              <w:t>6</w:t>
+            </w:r>
+            <w:r>
+              <w:rPr>
+                <w:noProof/>
+                <w:webHidden/>
+              </w:rPr>
+              <w:fldChar w:fldCharType="end"/>
+            </w:r>
+          </w:hyperlink>
+        </w:p>
+        <w:p>
+          <w:pPr>
+            <w:pStyle w:val="TOC2"/>
+            <w:tabs>
+              <w:tab w:val="right" w:leader="dot" w:pos="10070"/>
+            </w:tabs>
+            <w:rPr>
+              <w:noProof/>
+              <w:kern w:val="2"/>
+              <w:sz w:val="24"/>
+              <w:szCs w:val="24"/>
+              <w14:ligatures w14:val="standardContextual"/>
+            </w:rPr>
+          </w:pPr>
+          <w:hyperlink w:anchor="_Toc236761881" w:history="1">
+            <w:r>
+              <w:rPr>
+                <w:rStyle w:val="Hyperlink"/>
+                <w:rFonts w:ascii="Arial" w:hAnsi="Arial" w:cs="Arial"/>
+                <w:b/>
+                <w:bCs/>
+                <w:noProof/>
+                <w:lang w:val="es-DO"/>
+              </w:rPr>
+              <w:t>3.2 Necesidad de Compartir Datos entre Tareas</w:t>
+            </w:r>
+            <w:r>
+              <w:rPr>
+                <w:noProof/>
+                <w:webHidden/>
+              </w:rPr>
+              <w:tab/>
+            </w:r>
+            <w:r>
+              <w:rPr>
+                <w:noProof/>
+                <w:webHidden/>
+              </w:rPr>
+              <w:fldChar w:fldCharType="begin"/>
+            </w:r>
+            <w:r>
+              <w:rPr>
+                <w:noProof/>
+                <w:webHidden/>
+              </w:rPr>
+              <w:instrText xml:space="preserve"> PAGEREF _Toc236761881 \h </w:instrText>
+            </w:r>
+            <w:r>
+              <w:rPr>
+                <w:noProof/>
+                <w:webHidden/>
+              </w:rPr>
+            </w:r>
+            <w:r>
+              <w:rPr>
+                <w:noProof/>
+                <w:webHidden/>
+              </w:rPr>
+              <w:fldChar w:fldCharType="separate"/>
+            </w:r>
+            <w:r>
+              <w:rPr>
+                <w:noProof/>
+                <w:webHidden/>
+              </w:rPr>
+              <w:t>6</w:t>
+            </w:r>
+            <w:r>
+              <w:rPr>
+                <w:noProof/>
+                <w:webHidden/>
+              </w:rPr>
+              <w:fldChar w:fldCharType="end"/>
+            </w:r>
+          </w:hyperlink>
+        </w:p>
+        <w:p>
+          <w:pPr>
+            <w:pStyle w:val="TOC2"/>
+            <w:tabs>
+              <w:tab w:val="right" w:leader="dot" w:pos="10070"/>
+            </w:tabs>
+            <w:rPr>
+              <w:noProof/>
+              <w:kern w:val="2"/>
+              <w:sz w:val="24"/>
+              <w:szCs w:val="24"/>
+              <w14:ligatures w14:val="standardContextual"/>
+            </w:rPr>
+          </w:pPr>
+          <w:hyperlink w:anchor="_Toc236761882" w:history="1">
+            <w:r>
+              <w:rPr>
+                <w:rStyle w:val="Hyperlink"/>
+                <w:rFonts w:ascii="Arial" w:hAnsi="Arial" w:cs="Arial"/>
+                <w:b/>
+                <w:bCs/>
+                <w:noProof/>
+                <w:lang w:val="es-DO"/>
+              </w:rPr>
+              <w:t>3.3 Exploración de Diferentes Estrategias de Paralelización</w:t>
+            </w:r>
+            <w:r>
+              <w:rPr>
+                <w:noProof/>
+                <w:webHidden/>
+              </w:rPr>
+              <w:tab/>
+            </w:r>
+            <w:r>
+              <w:rPr>
+                <w:noProof/>
+                <w:webHidden/>
+              </w:rPr>
+              <w:fldChar w:fldCharType="begin"/>
+            </w:r>
+            <w:r>
+              <w:rPr>
+                <w:noProof/>
+                <w:webHidden/>
+              </w:rPr>
+              <w:instrText xml:space="preserve"> PAGEREF _Toc236761882 \h </w:instrText>
+            </w:r>
+            <w:r>
+              <w:rPr>
+                <w:noProof/>
+                <w:webHidden/>
+              </w:rPr>
+            </w:r>
+            <w:r>
+              <w:rPr>
+                <w:noProof/>
+                <w:webHidden/>
+              </w:rPr>
+              <w:fldChar w:fldCharType="separate"/>
+            </w:r>
+            <w:r>
+              <w:rPr>
+                <w:noProof/>
+                <w:webHidden/>
+              </w:rPr>
+              <w:t>7</w:t>
+            </w:r>
+            <w:r>
+              <w:rPr>
+                <w:noProof/>
+                <w:webHidden/>
+              </w:rPr>
+              <w:fldChar w:fldCharType="end"/>
+            </w:r>
+          </w:hyperlink>
+        </w:p>
+        <w:p>
+          <w:pPr>
+            <w:pStyle w:val="TOC2"/>
+            <w:tabs>
+              <w:tab w:val="right" w:leader="dot" w:pos="10070"/>
+            </w:tabs>
+            <w:rPr>
+              <w:noProof/>
+              <w:kern w:val="2"/>
+              <w:sz w:val="24"/>
+              <w:szCs w:val="24"/>
+              <w14:ligatures w14:val="standardContextual"/>
+            </w:rPr>
+          </w:pPr>
+          <w:hyperlink w:anchor="_Toc236761883" w:history="1">
+            <w:r>
+              <w:rPr>
+                <w:rStyle w:val="Hyperlink"/>
+                <w:rFonts w:ascii="Arial" w:hAnsi="Arial" w:cs="Arial"/>
+                <w:b/>
+                <w:bCs/>
+                <w:noProof/>
+                <w:lang w:val="es-DO"/>
+              </w:rPr>
+              <w:t>3.4 Escalabilidad con Más Recursos</w:t>
+            </w:r>
+            <w:r>
+              <w:rPr>
+                <w:noProof/>
+                <w:webHidden/>
+              </w:rPr>
+              <w:tab/>
+            </w:r>
+            <w:r>
+              <w:rPr>
+                <w:noProof/>
+                <w:webHidden/>
+              </w:rPr>
+              <w:fldChar w:fldCharType="begin"/>
+            </w:r>
+            <w:r>
+              <w:rPr>
+                <w:noProof/>
+                <w:webHidden/>
+              </w:rPr>
+              <w:instrText xml:space="preserve"> PAGEREF _Toc236761883 \h </w:instrText>
+            </w:r>
+            <w:r>
+              <w:rPr>
+                <w:noProof/>
+                <w:webHidden/>
+              </w:rPr>
+            </w:r>
+            <w:r>
+              <w:rPr>
+                <w:noProof/>
+                <w:webHidden/>
+              </w:rPr>
+              <w:fldChar w:fldCharType="separate"/>
+            </w:r>
+            <w:r>
+              <w:rPr>
+                <w:noProof/>
+                <w:webHidden/>
+              </w:rPr>
+              <w:t>7</w:t>
+            </w:r>
+            <w:r>
+              <w:rPr>
+                <w:noProof/>
+                <w:webHidden/>
+              </w:rPr>
+              <w:fldChar w:fldCharType="end"/>
+            </w:r>
+          </w:hyperlink>
+        </w:p>
+        <w:p>
+          <w:pPr>
+            <w:pStyle w:val="TOC2"/>
+            <w:tabs>
+              <w:tab w:val="right" w:leader="dot" w:pos="10070"/>
+            </w:tabs>
+            <w:rPr>
+              <w:noProof/>
+              <w:kern w:val="2"/>
+              <w:sz w:val="24"/>
+              <w:szCs w:val="24"/>
+              <w14:ligatures w14:val="standardContextual"/>
+            </w:rPr>
+          </w:pPr>
+          <w:hyperlink w:anchor="_Toc236761884" w:history="1">
+            <w:r>
+              <w:rPr>
+                <w:rStyle w:val="Hyperlink"/>
+                <w:rFonts w:ascii="Arial" w:hAnsi="Arial" w:cs="Arial"/>
+                <w:b/>
+                <w:bCs/>
+                <w:noProof/>
+              </w:rPr>
+              <w:t>3.5 Métricas de Evaluación del Rendimiento</w:t>
+            </w:r>
+            <w:r>
+              <w:rPr>
+                <w:noProof/>
+                <w:webHidden/>
+              </w:rPr>
+              <w:tab/>
+            </w:r>
+            <w:r>
+              <w:rPr>
+                <w:noProof/>
+                <w:webHidden/>
+              </w:rPr>
+              <w:fldChar w:fldCharType="begin"/>
+            </w:r>
+            <w:r>
+              <w:rPr>
+                <w:noProof/>
+                <w:webHidden/>
+              </w:rPr>
+              <w:instrText xml:space="preserve"> PAGEREF _Toc236761884 \h </w:instrText>
+            </w:r>
+            <w:r>
+              <w:rPr>
+                <w:noProof/>
+                <w:webHidden/>
+              </w:rPr>
+            </w:r>
+            <w:r>
+              <w:rPr>
+                <w:noProof/>
+                <w:webHidden/>
+              </w:rPr>
+              <w:fldChar w:fldCharType="separate"/>
+            </w:r>
+            <w:r>
+              <w:rPr>
+                <w:noProof/>
+                <w:webHidden/>
+              </w:rPr>
+              <w:t>7</w:t>
+            </w:r>
+            <w:r>
+              <w:rPr>
+                <w:noProof/>
+                <w:webHidden/>
+              </w:rPr>
+              <w:fldChar w:fldCharType="end"/>
+            </w:r>
+          </w:hyperlink>
+        </w:p>
+        <w:p>
+          <w:pPr>
+            <w:pStyle w:val="TOC2"/>
+            <w:tabs>
+              <w:tab w:val="right" w:leader="dot" w:pos="10070"/>
+            </w:tabs>
+            <w:rPr>
+              <w:noProof/>
+              <w:kern w:val="2"/>
+              <w:sz w:val="24"/>
+              <w:szCs w:val="24"/>
+              <w14:ligatures w14:val="standardContextual"/>
+            </w:rPr>
+          </w:pPr>
+          <w:hyperlink w:anchor="_Toc236761885" w:history="1">
+            <w:r>
+              <w:rPr>
+                <w:rStyle w:val="Hyperlink"/>
+                <w:rFonts w:ascii="Arial" w:hAnsi="Arial" w:cs="Arial"/>
+                <w:b/>
+                <w:bCs/>
+                <w:noProof/>
+                <w:lang w:val="es-DO"/>
+              </w:rPr>
+              <w:t>3.6 Aplicación a un Problema del Mundo Real</w:t>
+            </w:r>
+            <w:r>
+              <w:rPr>
+                <w:noProof/>
+                <w:webHidden/>
+              </w:rPr>
+              <w:tab/>
+            </w:r>
+            <w:r>
+              <w:rPr>
+                <w:noProof/>
+                <w:webHidden/>
+              </w:rPr>
+              <w:fldChar w:fldCharType="begin"/>
+            </w:r>
+            <w:r>
+              <w:rPr>
+                <w:noProof/>
+                <w:webHidden/>
+              </w:rPr>
+              <w:instrText xml:space="preserve"> PAGEREF _Toc236761885 \h </w:instrText>
+            </w:r>
+            <w:r>
+              <w:rPr>
+                <w:noProof/>
+                <w:webHidden/>
+              </w:rPr>
+            </w:r>
+            <w:r>
+              <w:rPr>
+                <w:noProof/>
+                <w:webHidden/>
+              </w:rPr>
+              <w:fldChar w:fldCharType="separate"/>
+            </w:r>
+            <w:r>
+              <w:rPr>
+                <w:noProof/>
+                <w:webHidden/>
+              </w:rPr>
+              <w:t>7</w:t>
+            </w:r>
+            <w:r>
+              <w:rPr>
+                <w:noProof/>
+                <w:webHidden/>
+              </w:rPr>
+              <w:fldChar w:fldCharType="end"/>
+            </w:r>
+          </w:hyperlink>
+        </w:p>
+        <w:p>
+          <w:pPr>
+            <w:pStyle w:val="TOCHeading"/>
             <w:spacing w:line="360" w:lineRule="auto"/>
             <w:rPr>
               <w:color w:val="auto"/>
@@ -1453,40 +2044,26 @@
         </w:tabs>
       </w:pPr>
       <w:r>
+        <w:lastRenderedPageBreak/>
         <w:tab/>
       </w:r>
-    </w:p>
-    <w:p>
-      <w:pPr>
-        <w:spacing w:line="278" w:lineRule="auto"/>
-      </w:pPr>
-      <w:r>
-        <w:br w:type="page"/>
-      </w:r>
-    </w:p>
-    <w:p>
-      <w:pPr>
-        <w:pStyle w:val="Ttulo1"/>
-        <w:rPr>
-          <w:rFonts w:ascii="Arial" w:hAnsi="Arial" w:cs="Arial"/>
-          <w:b/>
-          <w:bCs/>
-          <w:color w:val="auto"/>
+      <w:bookmarkStart w:id="0" w:name="_Toc236761869"/>
+    </w:p>
+    <w:p>
+      <w:pPr>
+        <w:tabs>
+          <w:tab w:val="left" w:pos="1130"/>
+        </w:tabs>
+      </w:pPr>
+      <w:r>
+        <w:rPr>
+          <w:rFonts w:ascii="Arial" w:hAnsi="Arial" w:cs="Arial"/>
+          <w:b/>
+          <w:bCs/>
           <w:sz w:val="28"/>
           <w:szCs w:val="28"/>
-        </w:rPr>
-      </w:pPr>
-      <w:bookmarkStart w:id="0" w:name="_Toc236754154"/>
-      <w:r>
-        <w:rPr>
-          <w:rFonts w:ascii="Arial" w:hAnsi="Arial" w:cs="Arial"/>
-          <w:b/>
-          <w:bCs/>
-          <w:color w:val="auto"/>
-          <w:sz w:val="28"/>
-          <w:szCs w:val="28"/>
-        </w:rPr>
-        <w:lastRenderedPageBreak/>
+          <w:lang w:val="es-DO"/>
+        </w:rPr>
         <w:t>1. INTRODUCCIÓN</w:t>
       </w:r>
       <w:bookmarkEnd w:id="0"/>
@@ -1498,11 +2075,14 @@
         </w:tabs>
         <w:spacing w:line="360" w:lineRule="auto"/>
         <w:jc w:val="both"/>
-      </w:pPr>
-    </w:p>
-    <w:p>
-      <w:pPr>
-        <w:pStyle w:val="Ttulo2"/>
+        <w:rPr>
+          <w:lang w:val="es-DO"/>
+        </w:rPr>
+      </w:pPr>
+    </w:p>
+    <w:p>
+      <w:pPr>
+        <w:pStyle w:val="Heading2"/>
         <w:spacing w:line="360" w:lineRule="auto"/>
         <w:jc w:val="both"/>
         <w:rPr>
@@ -1515,7 +2095,7 @@
           <w:lang w:val="es-DO"/>
         </w:rPr>
       </w:pPr>
-      <w:bookmarkStart w:id="1" w:name="_Toc236754155"/>
+      <w:bookmarkStart w:id="1" w:name="_Toc236761870"/>
       <w:r>
         <w:rPr>
           <w:rFonts w:ascii="Arial" w:hAnsi="Arial" w:cs="Arial"/>
@@ -1581,7 +2161,7 @@
     </w:p>
     <w:p>
       <w:pPr>
-        <w:pStyle w:val="Ttulo2"/>
+        <w:pStyle w:val="Heading2"/>
         <w:spacing w:line="360" w:lineRule="auto"/>
         <w:jc w:val="both"/>
         <w:rPr>
@@ -1594,7 +2174,7 @@
           <w:lang w:val="es-DO"/>
         </w:rPr>
       </w:pPr>
-      <w:bookmarkStart w:id="2" w:name="_Toc236754156"/>
+      <w:bookmarkStart w:id="2" w:name="_Toc236761871"/>
       <w:r>
         <w:rPr>
           <w:rFonts w:ascii="Arial" w:hAnsi="Arial" w:cs="Arial"/>
@@ -1660,7 +2240,7 @@
     </w:p>
     <w:p>
       <w:pPr>
-        <w:pStyle w:val="Ttulo2"/>
+        <w:pStyle w:val="Heading2"/>
         <w:spacing w:line="360" w:lineRule="auto"/>
         <w:jc w:val="both"/>
         <w:rPr>
@@ -1673,7 +2253,7 @@
           <w:lang w:val="es-DO"/>
         </w:rPr>
       </w:pPr>
-      <w:bookmarkStart w:id="3" w:name="_Toc236754157"/>
+      <w:bookmarkStart w:id="3" w:name="_Toc236761872"/>
       <w:r>
         <w:rPr>
           <w:rFonts w:ascii="Arial" w:hAnsi="Arial" w:cs="Arial"/>
@@ -1703,7 +2283,7 @@
     </w:p>
     <w:p>
       <w:pPr>
-        <w:pStyle w:val="Ttulo3"/>
+        <w:pStyle w:val="Heading3"/>
         <w:spacing w:line="360" w:lineRule="auto"/>
         <w:jc w:val="both"/>
         <w:rPr>
@@ -1716,7 +2296,7 @@
           <w:lang w:val="es-DO"/>
         </w:rPr>
       </w:pPr>
-      <w:bookmarkStart w:id="4" w:name="_Toc236754158"/>
+      <w:bookmarkStart w:id="4" w:name="_Toc236761873"/>
       <w:r>
         <w:rPr>
           <w:rFonts w:ascii="Arial" w:hAnsi="Arial" w:cs="Arial"/>
@@ -1818,7 +2398,7 @@
     </w:p>
     <w:p>
       <w:pPr>
-        <w:pStyle w:val="Ttulo3"/>
+        <w:pStyle w:val="Heading3"/>
         <w:spacing w:line="360" w:lineRule="auto"/>
         <w:jc w:val="both"/>
         <w:rPr>
@@ -1830,7 +2410,7 @@
           <w:szCs w:val="24"/>
         </w:rPr>
       </w:pPr>
-      <w:bookmarkStart w:id="5" w:name="_Toc236754159"/>
+      <w:bookmarkStart w:id="5" w:name="_Toc236761874"/>
       <w:r>
         <w:rPr>
           <w:rFonts w:ascii="Arial" w:hAnsi="Arial" w:cs="Arial"/>
@@ -2035,7 +2615,7 @@
     </w:p>
     <w:p>
       <w:pPr>
-        <w:pStyle w:val="Ttulo1"/>
+        <w:pStyle w:val="Heading1"/>
         <w:rPr>
           <w:rFonts w:ascii="Arial" w:hAnsi="Arial" w:cs="Arial"/>
           <w:b/>
@@ -2046,7 +2626,7 @@
           <w:lang w:val="es-DO"/>
         </w:rPr>
       </w:pPr>
-      <w:bookmarkStart w:id="6" w:name="_Toc236754160"/>
+      <w:bookmarkStart w:id="6" w:name="_Toc236761875"/>
       <w:r>
         <w:rPr>
           <w:rFonts w:ascii="Arial" w:hAnsi="Arial" w:cs="Arial"/>
@@ -2059,12 +2639,11 @@
         </w:rPr>
         <w:t>2. Descripción del Problema</w:t>
       </w:r>
-      <w:bookmarkStart w:id="7" w:name="_Toc236754161"/>
       <w:bookmarkEnd w:id="6"/>
     </w:p>
     <w:p>
       <w:pPr>
-        <w:pStyle w:val="Ttulo1"/>
+        <w:pStyle w:val="Heading1"/>
         <w:rPr>
           <w:rFonts w:ascii="Arial" w:hAnsi="Arial" w:cs="Arial"/>
           <w:b/>
@@ -2075,6 +2654,7 @@
           <w:lang w:val="es-DO"/>
         </w:rPr>
       </w:pPr>
+      <w:bookmarkStart w:id="7" w:name="_Toc236761876"/>
       <w:r>
         <w:rPr>
           <w:rFonts w:ascii="Arial" w:hAnsi="Arial" w:cs="Arial"/>
@@ -2095,6 +2675,7 @@
           <w:color w:val="auto"/>
           <w:sz w:val="24"/>
           <w:szCs w:val="24"/>
+          <w:lang w:val="es-DO"/>
         </w:rPr>
         <w:t>Contexto del Problema Seleccionado</w:t>
       </w:r>
@@ -2141,38 +2722,38 @@
           <w:rFonts w:ascii="Arial" w:hAnsi="Arial" w:cs="Arial"/>
           <w:sz w:val="24"/>
           <w:szCs w:val="24"/>
-        </w:rPr>
-      </w:pPr>
-      <w:r>
-        <w:rPr>
-          <w:rFonts w:ascii="Arial" w:hAnsi="Arial" w:cs="Arial"/>
-          <w:b/>
-          <w:bCs/>
-          <w:sz w:val="24"/>
-          <w:szCs w:val="24"/>
-        </w:rPr>
-        <w:t>L</w:t>
-      </w:r>
-      <w:r>
-        <w:rPr>
-          <w:rFonts w:ascii="Arial" w:hAnsi="Arial" w:cs="Arial"/>
-          <w:b/>
-          <w:bCs/>
-          <w:sz w:val="24"/>
-          <w:szCs w:val="24"/>
-        </w:rPr>
-        <w:t xml:space="preserve">a </w:t>
+          <w:lang w:val="es-DO"/>
+        </w:rPr>
+      </w:pPr>
+      <w:r>
+        <w:rPr>
+          <w:rFonts w:ascii="Arial" w:hAnsi="Arial" w:cs="Arial"/>
+          <w:b/>
+          <w:bCs/>
+          <w:sz w:val="24"/>
+          <w:szCs w:val="24"/>
+          <w:lang w:val="es-DO"/>
+        </w:rPr>
+        <w:t>La extracción</w:t>
+      </w:r>
+      <w:r>
+        <w:rPr>
+          <w:rFonts w:ascii="Arial" w:hAnsi="Arial" w:cs="Arial"/>
+          <w:sz w:val="24"/>
+          <w:szCs w:val="24"/>
+          <w:lang w:val="es-DO"/>
+        </w:rPr>
+        <w:t xml:space="preserve"> donde se estaría generando lotes de transacciones por </w:t>
       </w:r>
       <w:proofErr w:type="spellStart"/>
       <w:r>
         <w:rPr>
           <w:rFonts w:ascii="Arial" w:hAnsi="Arial" w:cs="Arial"/>
-          <w:b/>
-          <w:bCs/>
-          <w:sz w:val="24"/>
-          <w:szCs w:val="24"/>
-        </w:rPr>
-        <w:t>extracción</w:t>
+          <w:sz w:val="24"/>
+          <w:szCs w:val="24"/>
+          <w:lang w:val="es-DO"/>
+        </w:rPr>
+        <w:t>subsarles</w:t>
       </w:r>
       <w:proofErr w:type="spellEnd"/>
       <w:r>
@@ -2180,8 +2761,150 @@
           <w:rFonts w:ascii="Arial" w:hAnsi="Arial" w:cs="Arial"/>
           <w:sz w:val="24"/>
           <w:szCs w:val="24"/>
-        </w:rPr>
-        <w:t xml:space="preserve"> donde se </w:t>
+          <w:lang w:val="es-DO"/>
+        </w:rPr>
+        <w:t xml:space="preserve"> directamente en memoria.</w:t>
+      </w:r>
+    </w:p>
+    <w:p>
+      <w:pPr>
+        <w:jc w:val="both"/>
+        <w:rPr>
+          <w:rFonts w:ascii="Arial" w:hAnsi="Arial" w:cs="Arial"/>
+          <w:sz w:val="24"/>
+          <w:szCs w:val="24"/>
+          <w:lang w:val="es-ES"/>
+        </w:rPr>
+      </w:pPr>
+      <w:r>
+        <w:rPr>
+          <w:rFonts w:ascii="Arial" w:hAnsi="Arial" w:cs="Arial"/>
+          <w:sz w:val="24"/>
+          <w:szCs w:val="24"/>
+          <w:lang w:val="es-ES"/>
+        </w:rPr>
+        <w:t xml:space="preserve">También estaríamos incluyendo lo que es la </w:t>
+      </w:r>
+      <w:r>
+        <w:rPr>
+          <w:rFonts w:ascii="Arial" w:hAnsi="Arial" w:cs="Arial"/>
+          <w:b/>
+          <w:bCs/>
+          <w:sz w:val="24"/>
+          <w:szCs w:val="24"/>
+          <w:lang w:val="es-ES"/>
+        </w:rPr>
+        <w:t>transformación</w:t>
+      </w:r>
+      <w:r>
+        <w:rPr>
+          <w:rFonts w:ascii="Arial" w:hAnsi="Arial" w:cs="Arial"/>
+          <w:sz w:val="24"/>
+          <w:szCs w:val="24"/>
+          <w:lang w:val="es-ES"/>
+        </w:rPr>
+        <w:t>, en donde buscamos la normalización de todos los datos, calculando los totales, la discriminación de impuestos y estructuras en registro de clientes, productos y las ventas.</w:t>
+      </w:r>
+    </w:p>
+    <w:p>
+      <w:pPr>
+        <w:jc w:val="both"/>
+        <w:rPr>
+          <w:rFonts w:ascii="Arial" w:hAnsi="Arial" w:cs="Arial"/>
+          <w:sz w:val="24"/>
+          <w:szCs w:val="24"/>
+          <w:lang w:val="es-ES"/>
+        </w:rPr>
+      </w:pPr>
+      <w:r>
+        <w:rPr>
+          <w:rFonts w:ascii="Arial" w:hAnsi="Arial" w:cs="Arial"/>
+          <w:sz w:val="24"/>
+          <w:szCs w:val="24"/>
+          <w:lang w:val="es-ES"/>
+        </w:rPr>
+        <w:t xml:space="preserve">Por último, </w:t>
+      </w:r>
+      <w:r>
+        <w:rPr>
+          <w:rFonts w:ascii="Arial" w:hAnsi="Arial" w:cs="Arial"/>
+          <w:b/>
+          <w:bCs/>
+          <w:sz w:val="24"/>
+          <w:szCs w:val="24"/>
+          <w:lang w:val="es-ES"/>
+        </w:rPr>
+        <w:t xml:space="preserve">la carga </w:t>
+      </w:r>
+      <w:r>
+        <w:rPr>
+          <w:rFonts w:ascii="Arial" w:hAnsi="Arial" w:cs="Arial"/>
+          <w:sz w:val="24"/>
+          <w:szCs w:val="24"/>
+          <w:lang w:val="es-ES"/>
+        </w:rPr>
+        <w:t>en donde estaríamos consolidando los resultados parciales en una estructura unificada o en bases de datos relacionadas que estén centralizadas.</w:t>
+      </w:r>
+    </w:p>
+    <w:p>
+      <w:pPr>
+        <w:rPr>
+          <w:rFonts w:ascii="Arial" w:hAnsi="Arial" w:cs="Arial"/>
+          <w:b/>
+          <w:bCs/>
+          <w:sz w:val="24"/>
+          <w:szCs w:val="24"/>
+          <w:lang w:val="es-DO"/>
+        </w:rPr>
+      </w:pPr>
+    </w:p>
+    <w:p>
+      <w:pPr>
+        <w:pStyle w:val="Heading1"/>
+        <w:rPr>
+          <w:rFonts w:ascii="Arial" w:hAnsi="Arial" w:cs="Arial"/>
+          <w:b/>
+          <w:bCs/>
+          <w:color w:val="auto"/>
+          <w:sz w:val="24"/>
+          <w:szCs w:val="24"/>
+          <w:lang w:val="es-DO"/>
+        </w:rPr>
+      </w:pPr>
+      <w:bookmarkStart w:id="8" w:name="_Toc236761877"/>
+      <w:r>
+        <w:rPr>
+          <w:rFonts w:ascii="Arial" w:hAnsi="Arial" w:cs="Arial"/>
+          <w:b/>
+          <w:bCs/>
+          <w:color w:val="auto"/>
+          <w:sz w:val="24"/>
+          <w:szCs w:val="24"/>
+          <w:lang w:val="es-DO"/>
+        </w:rPr>
+        <w:lastRenderedPageBreak/>
+        <w:t>2.2 Aplicación del Problema en un Escenario Real</w:t>
+      </w:r>
+      <w:bookmarkEnd w:id="8"/>
+    </w:p>
+    <w:p>
+      <w:pPr>
+        <w:jc w:val="both"/>
+        <w:rPr>
+          <w:rFonts w:ascii="Arial" w:hAnsi="Arial" w:cs="Arial"/>
+          <w:sz w:val="24"/>
+          <w:szCs w:val="24"/>
+          <w:lang w:val="es-ES"/>
+        </w:rPr>
+      </w:pPr>
+      <w:r>
+        <w:rPr>
+          <w:rFonts w:ascii="Arial" w:hAnsi="Arial" w:cs="Arial"/>
+          <w:sz w:val="24"/>
+          <w:szCs w:val="24"/>
+          <w:lang w:val="es-ES"/>
+        </w:rPr>
+        <w:t xml:space="preserve">Este proyecto es fácilmente aplicable en escenarios de núcleo de los sistemas de inteligencia de negocios, consolas de procesamiento y motores analíticos de </w:t>
       </w:r>
       <w:proofErr w:type="spellStart"/>
       <w:r>
@@ -2189,8 +2912,9 @@
           <w:rFonts w:ascii="Arial" w:hAnsi="Arial" w:cs="Arial"/>
           <w:sz w:val="24"/>
           <w:szCs w:val="24"/>
-        </w:rPr>
-        <w:t>estaría</w:t>
+          <w:lang w:val="es-ES"/>
+        </w:rPr>
+        <w:t>retail</w:t>
       </w:r>
       <w:proofErr w:type="spellEnd"/>
       <w:r>
@@ -2198,6 +2922,202 @@
           <w:rFonts w:ascii="Arial" w:hAnsi="Arial" w:cs="Arial"/>
           <w:sz w:val="24"/>
           <w:szCs w:val="24"/>
+          <w:lang w:val="es-ES"/>
+        </w:rPr>
+        <w:t xml:space="preserve"> (Este básicamente es el sector de comercios al por menor, que vende productos o servicios de manera directa, como los supermercados, las tiendas de ropa y las farmacias de medicamentos) o banca.</w:t>
+      </w:r>
+    </w:p>
+    <w:p>
+      <w:pPr>
+        <w:rPr>
+          <w:rFonts w:ascii="Arial" w:hAnsi="Arial" w:cs="Arial"/>
+          <w:sz w:val="24"/>
+          <w:szCs w:val="24"/>
+          <w:lang w:val="es-DO"/>
+        </w:rPr>
+      </w:pPr>
+    </w:p>
+    <w:p>
+      <w:pPr>
+        <w:pStyle w:val="Heading1"/>
+        <w:jc w:val="both"/>
+        <w:rPr>
+          <w:rFonts w:ascii="Arial" w:hAnsi="Arial" w:cs="Arial"/>
+          <w:b/>
+          <w:bCs/>
+          <w:color w:val="auto"/>
+          <w:sz w:val="24"/>
+          <w:szCs w:val="24"/>
+          <w:lang w:val="es-DO"/>
+        </w:rPr>
+      </w:pPr>
+      <w:bookmarkStart w:id="9" w:name="_Toc236761878"/>
+      <w:r>
+        <w:rPr>
+          <w:rFonts w:ascii="Arial" w:hAnsi="Arial" w:cs="Arial"/>
+          <w:b/>
+          <w:bCs/>
+          <w:color w:val="auto"/>
+          <w:sz w:val="24"/>
+          <w:szCs w:val="24"/>
+          <w:lang w:val="es-DO"/>
+        </w:rPr>
+        <w:t>2.3 Importancia del Paralelismo en la Solución</w:t>
+      </w:r>
+      <w:bookmarkEnd w:id="9"/>
+    </w:p>
+    <w:p>
+      <w:pPr>
+        <w:jc w:val="both"/>
+        <w:rPr>
+          <w:rFonts w:ascii="Arial" w:hAnsi="Arial" w:cs="Arial"/>
+          <w:sz w:val="24"/>
+          <w:szCs w:val="24"/>
+          <w:lang w:val="es-ES"/>
+        </w:rPr>
+      </w:pPr>
+      <w:r>
+        <w:rPr>
+          <w:rFonts w:ascii="Arial" w:hAnsi="Arial" w:cs="Arial"/>
+          <w:sz w:val="24"/>
+          <w:szCs w:val="24"/>
+          <w:lang w:val="es-ES"/>
+        </w:rPr>
+        <w:t>Para este proyecto, priorizamos que el procesamiento sea secuencial y se procese un lote a la vez en un solo hilo de ejecución, dejando inactivas las demás unidades del procesador, con el paradigma paralelo y utilizando la descomposición de datos.</w:t>
+      </w:r>
+    </w:p>
+    <w:p>
+      <w:pPr>
+        <w:jc w:val="both"/>
+        <w:rPr>
+          <w:rFonts w:ascii="Arial" w:hAnsi="Arial" w:cs="Arial"/>
+          <w:sz w:val="24"/>
+          <w:szCs w:val="24"/>
+          <w:lang w:val="es-ES"/>
+        </w:rPr>
+      </w:pPr>
+      <w:r>
+        <w:rPr>
+          <w:rFonts w:ascii="Arial" w:hAnsi="Arial" w:cs="Arial"/>
+          <w:sz w:val="24"/>
+          <w:szCs w:val="24"/>
+          <w:lang w:val="es-ES"/>
+        </w:rPr>
+        <w:t xml:space="preserve">Esto nos ayudará significativamente a que el conjunto global de las transacciones se divida en </w:t>
+      </w:r>
+      <w:proofErr w:type="spellStart"/>
+      <w:r>
+        <w:rPr>
+          <w:rFonts w:ascii="Arial" w:hAnsi="Arial" w:cs="Arial"/>
+          <w:sz w:val="24"/>
+          <w:szCs w:val="24"/>
+          <w:lang w:val="es-ES"/>
+        </w:rPr>
+        <w:t>sub-bloques</w:t>
+      </w:r>
+      <w:proofErr w:type="spellEnd"/>
+      <w:r>
+        <w:rPr>
+          <w:rFonts w:ascii="Arial" w:hAnsi="Arial" w:cs="Arial"/>
+          <w:sz w:val="24"/>
+          <w:szCs w:val="24"/>
+          <w:lang w:val="es-ES"/>
+        </w:rPr>
+        <w:t xml:space="preserve"> de tamaño uniforme, y cada uno de los procesadores asuma la transformación de su bloque de forma independiente y simultánea, logrando así la reducción sustancial del tiempo de procesamiento que escala proporcionalmente con el número de procesadores físicos y lógicos disponible directamente en la máquina o computadora.</w:t>
+      </w:r>
+    </w:p>
+    <w:p>
+      <w:pPr>
+        <w:rPr>
+          <w:rFonts w:ascii="Arial" w:hAnsi="Arial" w:cs="Arial"/>
+          <w:b/>
+          <w:bCs/>
+          <w:sz w:val="24"/>
+          <w:szCs w:val="24"/>
+          <w:lang w:val="es-DO"/>
+        </w:rPr>
+      </w:pPr>
+    </w:p>
+    <w:p>
+      <w:pPr>
+        <w:pStyle w:val="Heading1"/>
+        <w:rPr>
+          <w:rFonts w:ascii="Arial" w:hAnsi="Arial" w:cs="Arial"/>
+          <w:b/>
+          <w:bCs/>
+          <w:color w:val="auto"/>
+          <w:sz w:val="28"/>
+          <w:szCs w:val="28"/>
+          <w:lang w:val="es-DO"/>
+        </w:rPr>
+      </w:pPr>
+      <w:bookmarkStart w:id="10" w:name="_Toc236761879"/>
+      <w:r>
+        <w:rPr>
+          <w:rFonts w:ascii="Arial" w:hAnsi="Arial" w:cs="Arial"/>
+          <w:b/>
+          <w:bCs/>
+          <w:color w:val="auto"/>
+          <w:sz w:val="28"/>
+          <w:szCs w:val="28"/>
+          <w:lang w:val="es-DO"/>
+        </w:rPr>
+        <w:t>3. CUMPLIMIENTO DE LOS REQUISITOS DEL PROYECTO</w:t>
+      </w:r>
+      <w:bookmarkEnd w:id="10"/>
+    </w:p>
+    <w:p>
+      <w:pPr>
+        <w:rPr>
+          <w:lang w:val="es-DO"/>
+        </w:rPr>
+      </w:pPr>
+    </w:p>
+    <w:p>
+      <w:pPr>
+        <w:pStyle w:val="Heading2"/>
+        <w:rPr>
+          <w:rFonts w:ascii="Arial" w:hAnsi="Arial" w:cs="Arial"/>
+          <w:b/>
+          <w:bCs/>
+          <w:color w:val="auto"/>
+          <w:sz w:val="24"/>
+          <w:szCs w:val="24"/>
+        </w:rPr>
+      </w:pPr>
+      <w:bookmarkStart w:id="11" w:name="_Toc236761880"/>
+      <w:r>
+        <w:rPr>
+          <w:rFonts w:ascii="Arial" w:hAnsi="Arial" w:cs="Arial"/>
+          <w:b/>
+          <w:bCs/>
+          <w:color w:val="auto"/>
+          <w:sz w:val="24"/>
+          <w:szCs w:val="24"/>
+        </w:rPr>
+        <w:t xml:space="preserve">3.1 </w:t>
+      </w:r>
+      <w:proofErr w:type="spellStart"/>
+      <w:r>
+        <w:rPr>
+          <w:rFonts w:ascii="Arial" w:hAnsi="Arial" w:cs="Arial"/>
+          <w:b/>
+          <w:bCs/>
+          <w:color w:val="auto"/>
+          <w:sz w:val="24"/>
+          <w:szCs w:val="24"/>
+        </w:rPr>
+        <w:t>Ejecución</w:t>
+      </w:r>
+      <w:proofErr w:type="spellEnd"/>
+      <w:r>
+        <w:rPr>
+          <w:rFonts w:ascii="Arial" w:hAnsi="Arial" w:cs="Arial"/>
+          <w:b/>
+          <w:bCs/>
+          <w:color w:val="auto"/>
+          <w:sz w:val="24"/>
+          <w:szCs w:val="24"/>
         </w:rPr>
         <w:t xml:space="preserve"> </w:t>
       </w:r>
@@ -2205,17 +3125,181 @@
       <w:r>
         <w:rPr>
           <w:rFonts w:ascii="Arial" w:hAnsi="Arial" w:cs="Arial"/>
-          <w:sz w:val="24"/>
-          <w:szCs w:val="24"/>
-        </w:rPr>
-        <w:t>generando</w:t>
+          <w:b/>
+          <w:bCs/>
+          <w:color w:val="auto"/>
+          <w:sz w:val="24"/>
+          <w:szCs w:val="24"/>
+        </w:rPr>
+        <w:t>Simultánea</w:t>
       </w:r>
       <w:proofErr w:type="spellEnd"/>
       <w:r>
         <w:rPr>
           <w:rFonts w:ascii="Arial" w:hAnsi="Arial" w:cs="Arial"/>
-          <w:sz w:val="24"/>
-          <w:szCs w:val="24"/>
+          <w:b/>
+          <w:bCs/>
+          <w:color w:val="auto"/>
+          <w:sz w:val="24"/>
+          <w:szCs w:val="24"/>
+        </w:rPr>
+        <w:t xml:space="preserve"> de </w:t>
+      </w:r>
+      <w:proofErr w:type="spellStart"/>
+      <w:r>
+        <w:rPr>
+          <w:rFonts w:ascii="Arial" w:hAnsi="Arial" w:cs="Arial"/>
+          <w:b/>
+          <w:bCs/>
+          <w:color w:val="auto"/>
+          <w:sz w:val="24"/>
+          <w:szCs w:val="24"/>
+        </w:rPr>
+        <w:t>Múltiples</w:t>
+      </w:r>
+      <w:proofErr w:type="spellEnd"/>
+      <w:r>
+        <w:rPr>
+          <w:rFonts w:ascii="Arial" w:hAnsi="Arial" w:cs="Arial"/>
+          <w:b/>
+          <w:bCs/>
+          <w:color w:val="auto"/>
+          <w:sz w:val="24"/>
+          <w:szCs w:val="24"/>
+        </w:rPr>
+        <w:t xml:space="preserve"> Tareas</w:t>
+      </w:r>
+      <w:bookmarkEnd w:id="11"/>
+    </w:p>
+    <w:p>
+      <w:pPr>
+        <w:rPr>
+          <w:rFonts w:ascii="Arial" w:hAnsi="Arial" w:cs="Arial"/>
+          <w:sz w:val="24"/>
+          <w:szCs w:val="24"/>
+          <w:lang w:val="es-DO"/>
+        </w:rPr>
+      </w:pPr>
+      <w:r>
+        <w:rPr>
+          <w:rFonts w:ascii="Arial" w:hAnsi="Arial" w:cs="Arial"/>
+          <w:sz w:val="24"/>
+          <w:szCs w:val="24"/>
+          <w:lang w:val="es-DO"/>
+        </w:rPr>
+        <w:t>El sistema lleva a cabo varias subtareas de procesamiento al mismo tiempo sobre la información transaccional que envían las sucursales. En este proceso, cada hilo o tarea trabaja en paralelo, ocupándose de un segmento específico de la carga global de ventas, lo que permite agilizar el procesamiento y mejorar el manejo de grandes volúmenes de información.</w:t>
+      </w:r>
+    </w:p>
+    <w:p>
+      <w:pPr>
+        <w:rPr>
+          <w:lang w:val="es-DO"/>
+        </w:rPr>
+      </w:pPr>
+    </w:p>
+    <w:p>
+      <w:pPr>
+        <w:pStyle w:val="Heading2"/>
+        <w:rPr>
+          <w:rFonts w:ascii="Arial" w:hAnsi="Arial" w:cs="Arial"/>
+          <w:b/>
+          <w:bCs/>
+          <w:color w:val="auto"/>
+          <w:sz w:val="24"/>
+          <w:szCs w:val="24"/>
+          <w:lang w:val="es-DO"/>
+        </w:rPr>
+      </w:pPr>
+      <w:bookmarkStart w:id="12" w:name="_Toc236761881"/>
+      <w:r>
+        <w:rPr>
+          <w:rFonts w:ascii="Arial" w:hAnsi="Arial" w:cs="Arial"/>
+          <w:b/>
+          <w:bCs/>
+          <w:color w:val="auto"/>
+          <w:sz w:val="24"/>
+          <w:szCs w:val="24"/>
+          <w:lang w:val="es-DO"/>
+        </w:rPr>
+        <w:t>3.2 Necesidad de Compartir Datos entre Tareas</w:t>
+      </w:r>
+      <w:bookmarkEnd w:id="12"/>
+    </w:p>
+    <w:p>
+      <w:pPr>
+        <w:rPr>
+          <w:rFonts w:ascii="Arial" w:hAnsi="Arial" w:cs="Arial"/>
+          <w:sz w:val="24"/>
+          <w:szCs w:val="24"/>
+          <w:lang w:val="es-DO"/>
+        </w:rPr>
+      </w:pPr>
+      <w:r>
+        <w:rPr>
+          <w:rFonts w:ascii="Arial" w:hAnsi="Arial" w:cs="Arial"/>
+          <w:sz w:val="24"/>
+          <w:szCs w:val="24"/>
+          <w:lang w:val="es-DO"/>
+        </w:rPr>
+        <w:t xml:space="preserve">Cuando múltiples hilos o tareas paralelas necesitan acceder y actualizar datos compartidos, surge un reto importante. Estos datos pueden ser, por ejemplo, totales de ventas que se van acumulando, contadores que registran operaciones o la inserción de entidades de clientes y productos en estructuras de datos centralizadas o incluso en una base de datos común. Si todos acceden sin control, el orden de ejecución puede mezclarse, provocando inconsistencias. Por eso se usan mecanismos como bloqueos o </w:t>
+      </w:r>
+      <w:proofErr w:type="spellStart"/>
+      <w:r>
+        <w:rPr>
+          <w:rFonts w:ascii="Arial" w:hAnsi="Arial" w:cs="Arial"/>
+          <w:sz w:val="24"/>
+          <w:szCs w:val="24"/>
+          <w:lang w:val="es-DO"/>
+        </w:rPr>
+        <w:t>locks</w:t>
+      </w:r>
+      <w:proofErr w:type="spellEnd"/>
+      <w:r>
+        <w:rPr>
+          <w:rFonts w:ascii="Arial" w:hAnsi="Arial" w:cs="Arial"/>
+          <w:sz w:val="24"/>
+          <w:szCs w:val="24"/>
+          <w:lang w:val="es-DO"/>
+        </w:rPr>
+        <w:t xml:space="preserve">, objetos concurrentes o colecciones </w:t>
+      </w:r>
+      <w:proofErr w:type="spellStart"/>
+      <w:r>
+        <w:rPr>
+          <w:rFonts w:ascii="Arial" w:hAnsi="Arial" w:cs="Arial"/>
+          <w:sz w:val="24"/>
+          <w:szCs w:val="24"/>
+          <w:lang w:val="es-DO"/>
+        </w:rPr>
+        <w:t>thread-safe</w:t>
+      </w:r>
+      <w:proofErr w:type="spellEnd"/>
+      <w:r>
+        <w:rPr>
+          <w:rFonts w:ascii="Arial" w:hAnsi="Arial" w:cs="Arial"/>
+          <w:sz w:val="24"/>
+          <w:szCs w:val="24"/>
+          <w:lang w:val="es-DO"/>
+        </w:rPr>
+        <w:t xml:space="preserve">. Estos mecanismos coordinan quién lee o escribe en cada momento, asegurando que las operaciones no se pisen entre sí y reduciendo el riesgo de </w:t>
+      </w:r>
+      <w:proofErr w:type="spellStart"/>
+      <w:r>
+        <w:rPr>
+          <w:rFonts w:ascii="Arial" w:hAnsi="Arial" w:cs="Arial"/>
+          <w:sz w:val="24"/>
+          <w:szCs w:val="24"/>
+          <w:lang w:val="es-DO"/>
+        </w:rPr>
+        <w:t>race</w:t>
+      </w:r>
+      <w:proofErr w:type="spellEnd"/>
+      <w:r>
+        <w:rPr>
+          <w:rFonts w:ascii="Arial" w:hAnsi="Arial" w:cs="Arial"/>
+          <w:sz w:val="24"/>
+          <w:szCs w:val="24"/>
+          <w:lang w:val="es-DO"/>
         </w:rPr>
         <w:t xml:space="preserve"> </w:t>
       </w:r>
@@ -2225,8 +3309,9 @@
           <w:rFonts w:ascii="Arial" w:hAnsi="Arial" w:cs="Arial"/>
           <w:sz w:val="24"/>
           <w:szCs w:val="24"/>
-        </w:rPr>
-        <w:t>lotes</w:t>
+          <w:lang w:val="es-DO"/>
+        </w:rPr>
+        <w:t>conditions</w:t>
       </w:r>
       <w:proofErr w:type="spellEnd"/>
       <w:r>
@@ -2234,6 +3319,440 @@
           <w:rFonts w:ascii="Arial" w:hAnsi="Arial" w:cs="Arial"/>
           <w:sz w:val="24"/>
           <w:szCs w:val="24"/>
+          <w:lang w:val="es-DO"/>
+        </w:rPr>
+        <w:t>, que son precisamente esas situaciones donde el resultado depende del orden no determinista en que los hilos acceden a los datos.</w:t>
+      </w:r>
+    </w:p>
+    <w:p>
+      <w:pPr>
+        <w:rPr>
+          <w:rFonts w:ascii="Arial" w:hAnsi="Arial" w:cs="Arial"/>
+          <w:sz w:val="24"/>
+          <w:szCs w:val="24"/>
+          <w:lang w:val="es-DO"/>
+        </w:rPr>
+      </w:pPr>
+    </w:p>
+    <w:p>
+      <w:pPr>
+        <w:pStyle w:val="Heading2"/>
+        <w:rPr>
+          <w:rFonts w:ascii="Arial" w:hAnsi="Arial" w:cs="Arial"/>
+          <w:b/>
+          <w:bCs/>
+          <w:color w:val="auto"/>
+          <w:sz w:val="24"/>
+          <w:szCs w:val="24"/>
+          <w:lang w:val="es-DO"/>
+        </w:rPr>
+      </w:pPr>
+      <w:bookmarkStart w:id="13" w:name="_Toc236761882"/>
+      <w:r>
+        <w:rPr>
+          <w:rFonts w:ascii="Arial" w:hAnsi="Arial" w:cs="Arial"/>
+          <w:b/>
+          <w:bCs/>
+          <w:color w:val="auto"/>
+          <w:sz w:val="24"/>
+          <w:szCs w:val="24"/>
+          <w:lang w:val="es-DO"/>
+        </w:rPr>
+        <w:t>3.3 Exploración de Diferentes Estrategias de Paralelización</w:t>
+      </w:r>
+      <w:bookmarkEnd w:id="13"/>
+    </w:p>
+    <w:p>
+      <w:pPr>
+        <w:rPr>
+          <w:rFonts w:ascii="Arial" w:hAnsi="Arial" w:cs="Arial"/>
+          <w:sz w:val="24"/>
+          <w:szCs w:val="24"/>
+          <w:lang w:val="es-DO"/>
+        </w:rPr>
+      </w:pPr>
+      <w:r>
+        <w:rPr>
+          <w:rFonts w:ascii="Arial" w:hAnsi="Arial" w:cs="Arial"/>
+          <w:sz w:val="24"/>
+          <w:szCs w:val="24"/>
+          <w:lang w:val="es-DO"/>
+        </w:rPr>
+        <w:t>El sistema evalúa cuatro modos de ejecución sobre la misma carga de datos. El primero es el modo secuencial, con un recorrido mediante un bucle iterativo lineal, usando estructuras como '</w:t>
+      </w:r>
+      <w:proofErr w:type="spellStart"/>
+      <w:r>
+        <w:rPr>
+          <w:rFonts w:ascii="Arial" w:hAnsi="Arial" w:cs="Arial"/>
+          <w:sz w:val="24"/>
+          <w:szCs w:val="24"/>
+          <w:lang w:val="es-DO"/>
+        </w:rPr>
+        <w:t>for</w:t>
+      </w:r>
+      <w:proofErr w:type="spellEnd"/>
+      <w:r>
+        <w:rPr>
+          <w:rFonts w:ascii="Arial" w:hAnsi="Arial" w:cs="Arial"/>
+          <w:sz w:val="24"/>
+          <w:szCs w:val="24"/>
+          <w:lang w:val="es-DO"/>
+        </w:rPr>
+        <w:t>' o '</w:t>
+      </w:r>
+      <w:proofErr w:type="spellStart"/>
+      <w:r>
+        <w:rPr>
+          <w:rFonts w:ascii="Arial" w:hAnsi="Arial" w:cs="Arial"/>
+          <w:sz w:val="24"/>
+          <w:szCs w:val="24"/>
+          <w:lang w:val="es-DO"/>
+        </w:rPr>
+        <w:t>for-each</w:t>
+      </w:r>
+      <w:proofErr w:type="spellEnd"/>
+      <w:r>
+        <w:rPr>
+          <w:rFonts w:ascii="Arial" w:hAnsi="Arial" w:cs="Arial"/>
+          <w:sz w:val="24"/>
+          <w:szCs w:val="24"/>
+          <w:lang w:val="es-DO"/>
+        </w:rPr>
+        <w:t>'. El segundo es el modo paralelo de alto nivel, como '</w:t>
+      </w:r>
+      <w:proofErr w:type="spellStart"/>
+      <w:r>
+        <w:rPr>
+          <w:rFonts w:ascii="Arial" w:hAnsi="Arial" w:cs="Arial"/>
+          <w:sz w:val="24"/>
+          <w:szCs w:val="24"/>
+          <w:lang w:val="es-DO"/>
+        </w:rPr>
+        <w:t>Parallel</w:t>
+      </w:r>
+      <w:proofErr w:type="spellEnd"/>
+      <w:r>
+        <w:rPr>
+          <w:rFonts w:ascii="Arial" w:hAnsi="Arial" w:cs="Arial"/>
+          <w:sz w:val="24"/>
+          <w:szCs w:val="24"/>
+          <w:lang w:val="es-DO"/>
+        </w:rPr>
+        <w:t xml:space="preserve"> For', con balanceo de carga gestionado automáticamente, apoyado por la TPL. El tercero se basa en tareas, por ejemplo, usando </w:t>
+      </w:r>
+      <w:proofErr w:type="spellStart"/>
+      <w:r>
+        <w:rPr>
+          <w:rFonts w:ascii="Arial" w:hAnsi="Arial" w:cs="Arial"/>
+          <w:sz w:val="24"/>
+          <w:szCs w:val="24"/>
+          <w:lang w:val="es-DO"/>
+        </w:rPr>
+        <w:t>Task</w:t>
+      </w:r>
+      <w:proofErr w:type="spellEnd"/>
+      <w:r>
+        <w:rPr>
+          <w:rFonts w:ascii="Arial" w:hAnsi="Arial" w:cs="Arial"/>
+          <w:sz w:val="24"/>
+          <w:szCs w:val="24"/>
+          <w:lang w:val="es-DO"/>
+        </w:rPr>
+        <w:t xml:space="preserve"> Factory, 'Start New </w:t>
+      </w:r>
+      <w:proofErr w:type="spellStart"/>
+      <w:r>
+        <w:rPr>
+          <w:rFonts w:ascii="Arial" w:hAnsi="Arial" w:cs="Arial"/>
+          <w:sz w:val="24"/>
+          <w:szCs w:val="24"/>
+          <w:lang w:val="es-DO"/>
+        </w:rPr>
+        <w:t>Task</w:t>
+      </w:r>
+      <w:proofErr w:type="spellEnd"/>
+      <w:r>
+        <w:rPr>
+          <w:rFonts w:ascii="Arial" w:hAnsi="Arial" w:cs="Arial"/>
+          <w:sz w:val="24"/>
+          <w:szCs w:val="24"/>
+          <w:lang w:val="es-DO"/>
+        </w:rPr>
+        <w:t>' o '</w:t>
+      </w:r>
+      <w:proofErr w:type="spellStart"/>
+      <w:r>
+        <w:rPr>
+          <w:rFonts w:ascii="Arial" w:hAnsi="Arial" w:cs="Arial"/>
+          <w:sz w:val="24"/>
+          <w:szCs w:val="24"/>
+          <w:lang w:val="es-DO"/>
+        </w:rPr>
+        <w:t>Task</w:t>
+      </w:r>
+      <w:proofErr w:type="spellEnd"/>
+      <w:r>
+        <w:rPr>
+          <w:rFonts w:ascii="Arial" w:hAnsi="Arial" w:cs="Arial"/>
+          <w:sz w:val="24"/>
+          <w:szCs w:val="24"/>
+          <w:lang w:val="es-DO"/>
+        </w:rPr>
+        <w:t xml:space="preserve"> Run', con particionamiento manual de bloques asignados a un arreglo de tareas. Y el cuarto modo utiliza hilos nativos, creando e iniciando objetos </w:t>
+      </w:r>
+      <w:proofErr w:type="spellStart"/>
+      <w:r>
+        <w:rPr>
+          <w:rFonts w:ascii="Arial" w:hAnsi="Arial" w:cs="Arial"/>
+          <w:sz w:val="24"/>
+          <w:szCs w:val="24"/>
+          <w:lang w:val="es-DO"/>
+        </w:rPr>
+        <w:t>Thread</w:t>
+      </w:r>
+      <w:proofErr w:type="spellEnd"/>
+      <w:r>
+        <w:rPr>
+          <w:rFonts w:ascii="Arial" w:hAnsi="Arial" w:cs="Arial"/>
+          <w:sz w:val="24"/>
+          <w:szCs w:val="24"/>
+          <w:lang w:val="es-DO"/>
+        </w:rPr>
+        <w:t xml:space="preserve"> de manera explícita, pasando estructuras de datos compartidas, y gestionando el inicio y la transferencia entre hilos. En este contexto se consideran estrategias de '</w:t>
+      </w:r>
+      <w:proofErr w:type="spellStart"/>
+      <w:r>
+        <w:rPr>
+          <w:rFonts w:ascii="Arial" w:hAnsi="Arial" w:cs="Arial"/>
+          <w:sz w:val="24"/>
+          <w:szCs w:val="24"/>
+          <w:lang w:val="es-DO"/>
+        </w:rPr>
+        <w:t>start</w:t>
+      </w:r>
+      <w:proofErr w:type="spellEnd"/>
+      <w:r>
+        <w:rPr>
+          <w:rFonts w:ascii="Arial" w:hAnsi="Arial" w:cs="Arial"/>
+          <w:sz w:val="24"/>
+          <w:szCs w:val="24"/>
+          <w:lang w:val="es-DO"/>
+        </w:rPr>
+        <w:t xml:space="preserve"> </w:t>
+      </w:r>
+      <w:proofErr w:type="spellStart"/>
+      <w:r>
+        <w:rPr>
+          <w:rFonts w:ascii="Arial" w:hAnsi="Arial" w:cs="Arial"/>
+          <w:sz w:val="24"/>
+          <w:szCs w:val="24"/>
+          <w:lang w:val="es-DO"/>
+        </w:rPr>
+        <w:t>row</w:t>
+      </w:r>
+      <w:proofErr w:type="spellEnd"/>
+      <w:r>
+        <w:rPr>
+          <w:rFonts w:ascii="Arial" w:hAnsi="Arial" w:cs="Arial"/>
+          <w:sz w:val="24"/>
+          <w:szCs w:val="24"/>
+          <w:lang w:val="es-DO"/>
+        </w:rPr>
+        <w:t>' y '</w:t>
+      </w:r>
+      <w:proofErr w:type="spellStart"/>
+      <w:r>
+        <w:rPr>
+          <w:rFonts w:ascii="Arial" w:hAnsi="Arial" w:cs="Arial"/>
+          <w:sz w:val="24"/>
+          <w:szCs w:val="24"/>
+          <w:lang w:val="es-DO"/>
+        </w:rPr>
+        <w:t>end</w:t>
+      </w:r>
+      <w:proofErr w:type="spellEnd"/>
+      <w:r>
+        <w:rPr>
+          <w:rFonts w:ascii="Arial" w:hAnsi="Arial" w:cs="Arial"/>
+          <w:sz w:val="24"/>
+          <w:szCs w:val="24"/>
+          <w:lang w:val="es-DO"/>
+        </w:rPr>
+        <w:t xml:space="preserve"> </w:t>
+      </w:r>
+      <w:proofErr w:type="spellStart"/>
+      <w:r>
+        <w:rPr>
+          <w:rFonts w:ascii="Arial" w:hAnsi="Arial" w:cs="Arial"/>
+          <w:sz w:val="24"/>
+          <w:szCs w:val="24"/>
+          <w:lang w:val="es-DO"/>
+        </w:rPr>
+        <w:t>row</w:t>
+      </w:r>
+      <w:proofErr w:type="spellEnd"/>
+      <w:r>
+        <w:rPr>
+          <w:rFonts w:ascii="Arial" w:hAnsi="Arial" w:cs="Arial"/>
+          <w:sz w:val="24"/>
+          <w:szCs w:val="24"/>
+          <w:lang w:val="es-DO"/>
+        </w:rPr>
+        <w:t>' para controlar el particionamiento.</w:t>
+      </w:r>
+    </w:p>
+    <w:p>
+      <w:pPr>
+        <w:rPr>
+          <w:rFonts w:ascii="Arial" w:hAnsi="Arial" w:cs="Arial"/>
+          <w:sz w:val="24"/>
+          <w:szCs w:val="24"/>
+          <w:lang w:val="es-DO"/>
+        </w:rPr>
+      </w:pPr>
+    </w:p>
+    <w:p>
+      <w:pPr>
+        <w:pStyle w:val="Heading2"/>
+        <w:rPr>
+          <w:rFonts w:ascii="Arial" w:hAnsi="Arial" w:cs="Arial"/>
+          <w:b/>
+          <w:bCs/>
+          <w:color w:val="auto"/>
+          <w:sz w:val="24"/>
+          <w:szCs w:val="24"/>
+          <w:lang w:val="es-DO"/>
+        </w:rPr>
+      </w:pPr>
+      <w:bookmarkStart w:id="14" w:name="_Toc236761883"/>
+      <w:r>
+        <w:rPr>
+          <w:rFonts w:ascii="Arial" w:hAnsi="Arial" w:cs="Arial"/>
+          <w:b/>
+          <w:bCs/>
+          <w:color w:val="auto"/>
+          <w:sz w:val="24"/>
+          <w:szCs w:val="24"/>
+          <w:lang w:val="es-DO"/>
+        </w:rPr>
+        <w:t>3.4 Escalabilidad con Más Recursos</w:t>
+      </w:r>
+      <w:bookmarkEnd w:id="14"/>
+    </w:p>
+    <w:p>
+      <w:pPr>
+        <w:rPr>
+          <w:rFonts w:ascii="Arial" w:hAnsi="Arial" w:cs="Arial"/>
+          <w:sz w:val="24"/>
+          <w:szCs w:val="24"/>
+          <w:lang w:val="es-DO"/>
+        </w:rPr>
+      </w:pPr>
+      <w:r>
+        <w:rPr>
+          <w:rFonts w:ascii="Arial" w:hAnsi="Arial" w:cs="Arial"/>
+          <w:sz w:val="24"/>
+          <w:szCs w:val="24"/>
+          <w:lang w:val="es-DO"/>
+        </w:rPr>
+        <w:t>a mayor cantidad de núcleos e hilos disponibles, mayor será la capacidad del sistema para repartir la carga y reducir los tiempos de procesamiento. En este enfoque, el usuario puede configurar dinámicamente cuántos procesadores utilizar, ajustando el '</w:t>
+      </w:r>
+      <w:proofErr w:type="spellStart"/>
+      <w:r>
+        <w:rPr>
+          <w:rFonts w:ascii="Arial" w:hAnsi="Arial" w:cs="Arial"/>
+          <w:sz w:val="24"/>
+          <w:szCs w:val="24"/>
+          <w:lang w:val="es-DO"/>
+        </w:rPr>
+        <w:t>processor</w:t>
+      </w:r>
+      <w:proofErr w:type="spellEnd"/>
+      <w:r>
+        <w:rPr>
+          <w:rFonts w:ascii="Arial" w:hAnsi="Arial" w:cs="Arial"/>
+          <w:sz w:val="24"/>
+          <w:szCs w:val="24"/>
+          <w:lang w:val="es-DO"/>
+        </w:rPr>
+        <w:t xml:space="preserve"> </w:t>
+      </w:r>
+      <w:proofErr w:type="spellStart"/>
+      <w:r>
+        <w:rPr>
+          <w:rFonts w:ascii="Arial" w:hAnsi="Arial" w:cs="Arial"/>
+          <w:sz w:val="24"/>
+          <w:szCs w:val="24"/>
+          <w:lang w:val="es-DO"/>
+        </w:rPr>
+        <w:t>count</w:t>
+      </w:r>
+      <w:proofErr w:type="spellEnd"/>
+      <w:r>
+        <w:rPr>
+          <w:rFonts w:ascii="Arial" w:hAnsi="Arial" w:cs="Arial"/>
+          <w:sz w:val="24"/>
+          <w:szCs w:val="24"/>
+          <w:lang w:val="es-DO"/>
+        </w:rPr>
+        <w:t>', de modo que el paralelismo se adapte al hardware disponible. El problema puede crecer de miles a millones de registros y el enfoque busca que, al aumentar los recursos, el tiempo de ejecución disminuya significativamente.</w:t>
+      </w:r>
+    </w:p>
+    <w:p>
+      <w:pPr>
+        <w:rPr>
+          <w:rFonts w:ascii="Arial" w:hAnsi="Arial" w:cs="Arial"/>
+          <w:sz w:val="24"/>
+          <w:szCs w:val="24"/>
+          <w:lang w:val="es-DO"/>
+        </w:rPr>
+      </w:pPr>
+    </w:p>
+    <w:p>
+      <w:pPr>
+        <w:pStyle w:val="Heading2"/>
+        <w:rPr>
+          <w:rFonts w:ascii="Arial" w:hAnsi="Arial" w:cs="Arial"/>
+          <w:b/>
+          <w:bCs/>
+          <w:color w:val="auto"/>
+          <w:sz w:val="24"/>
+          <w:szCs w:val="24"/>
+        </w:rPr>
+      </w:pPr>
+      <w:bookmarkStart w:id="15" w:name="_Toc236761884"/>
+      <w:r>
+        <w:rPr>
+          <w:rFonts w:ascii="Arial" w:hAnsi="Arial" w:cs="Arial"/>
+          <w:b/>
+          <w:bCs/>
+          <w:color w:val="auto"/>
+          <w:sz w:val="24"/>
+          <w:szCs w:val="24"/>
+        </w:rPr>
+        <w:t xml:space="preserve">3.5 </w:t>
+      </w:r>
+      <w:proofErr w:type="spellStart"/>
+      <w:r>
+        <w:rPr>
+          <w:rFonts w:ascii="Arial" w:hAnsi="Arial" w:cs="Arial"/>
+          <w:b/>
+          <w:bCs/>
+          <w:color w:val="auto"/>
+          <w:sz w:val="24"/>
+          <w:szCs w:val="24"/>
+        </w:rPr>
+        <w:t>Métricas</w:t>
+      </w:r>
+      <w:proofErr w:type="spellEnd"/>
+      <w:r>
+        <w:rPr>
+          <w:rFonts w:ascii="Arial" w:hAnsi="Arial" w:cs="Arial"/>
+          <w:b/>
+          <w:bCs/>
+          <w:color w:val="auto"/>
+          <w:sz w:val="24"/>
+          <w:szCs w:val="24"/>
         </w:rPr>
         <w:t xml:space="preserve"> de </w:t>
       </w:r>
@@ -2241,37 +3760,58 @@
       <w:r>
         <w:rPr>
           <w:rFonts w:ascii="Arial" w:hAnsi="Arial" w:cs="Arial"/>
-          <w:sz w:val="24"/>
-          <w:szCs w:val="24"/>
-        </w:rPr>
-        <w:t>transacciones</w:t>
+          <w:b/>
+          <w:bCs/>
+          <w:color w:val="auto"/>
+          <w:sz w:val="24"/>
+          <w:szCs w:val="24"/>
+        </w:rPr>
+        <w:t>Evaluación</w:t>
       </w:r>
       <w:proofErr w:type="spellEnd"/>
       <w:r>
         <w:rPr>
           <w:rFonts w:ascii="Arial" w:hAnsi="Arial" w:cs="Arial"/>
-          <w:sz w:val="24"/>
-          <w:szCs w:val="24"/>
-        </w:rPr>
-        <w:t xml:space="preserve"> por </w:t>
+          <w:b/>
+          <w:bCs/>
+          <w:color w:val="auto"/>
+          <w:sz w:val="24"/>
+          <w:szCs w:val="24"/>
+        </w:rPr>
+        <w:t xml:space="preserve"> del </w:t>
       </w:r>
       <w:proofErr w:type="spellStart"/>
       <w:r>
         <w:rPr>
           <w:rFonts w:ascii="Arial" w:hAnsi="Arial" w:cs="Arial"/>
-          <w:sz w:val="24"/>
-          <w:szCs w:val="24"/>
-        </w:rPr>
-        <w:t>subsarles</w:t>
-      </w:r>
+          <w:b/>
+          <w:bCs/>
+          <w:color w:val="auto"/>
+          <w:sz w:val="24"/>
+          <w:szCs w:val="24"/>
+        </w:rPr>
+        <w:t>Rendimiento</w:t>
+      </w:r>
+      <w:bookmarkEnd w:id="15"/>
       <w:proofErr w:type="spellEnd"/>
-      <w:r>
-        <w:rPr>
-          <w:rFonts w:ascii="Arial" w:hAnsi="Arial" w:cs="Arial"/>
-          <w:sz w:val="24"/>
-          <w:szCs w:val="24"/>
-        </w:rPr>
-        <w:t xml:space="preserve"> </w:t>
+    </w:p>
+    <w:p>
+      <w:pPr>
+        <w:rPr>
+          <w:rFonts w:ascii="Arial" w:hAnsi="Arial" w:cs="Arial"/>
+          <w:sz w:val="24"/>
+          <w:szCs w:val="24"/>
+          <w:lang w:val="es-DO"/>
+        </w:rPr>
+      </w:pPr>
+      <w:r>
+        <w:rPr>
+          <w:rFonts w:ascii="Arial" w:hAnsi="Arial" w:cs="Arial"/>
+          <w:sz w:val="24"/>
+          <w:szCs w:val="24"/>
+          <w:lang w:val="es-DO"/>
+        </w:rPr>
+        <w:t xml:space="preserve">Para evaluar el desempeño, se integra la clase </w:t>
       </w:r>
       <w:proofErr w:type="spellStart"/>
       <w:r>
@@ -2279,8 +3819,9 @@
           <w:rFonts w:ascii="Arial" w:hAnsi="Arial" w:cs="Arial"/>
           <w:sz w:val="24"/>
           <w:szCs w:val="24"/>
-        </w:rPr>
-        <w:t>directamente</w:t>
+          <w:lang w:val="es-DO"/>
+        </w:rPr>
+        <w:t>Stopwatch</w:t>
       </w:r>
       <w:proofErr w:type="spellEnd"/>
       <w:r>
@@ -2288,123 +3829,55 @@
           <w:rFonts w:ascii="Arial" w:hAnsi="Arial" w:cs="Arial"/>
           <w:sz w:val="24"/>
           <w:szCs w:val="24"/>
-        </w:rPr>
-        <w:t xml:space="preserve"> en memoria.</w:t>
-      </w:r>
-    </w:p>
-    <w:p>
-      <w:pPr>
-        <w:jc w:val="both"/>
-        <w:rPr>
-          <w:rFonts w:ascii="Arial" w:hAnsi="Arial" w:cs="Arial"/>
-          <w:sz w:val="24"/>
-          <w:szCs w:val="24"/>
-          <w:lang w:val="es-ES"/>
-        </w:rPr>
-      </w:pPr>
-      <w:r>
-        <w:rPr>
-          <w:rFonts w:ascii="Arial" w:hAnsi="Arial" w:cs="Arial"/>
-          <w:sz w:val="24"/>
-          <w:szCs w:val="24"/>
-          <w:lang w:val="es-ES"/>
-        </w:rPr>
-        <w:t xml:space="preserve">También estaríamos incluyendo lo que es la </w:t>
-      </w:r>
-      <w:r>
-        <w:rPr>
-          <w:rFonts w:ascii="Arial" w:hAnsi="Arial" w:cs="Arial"/>
-          <w:b/>
-          <w:bCs/>
-          <w:sz w:val="24"/>
-          <w:szCs w:val="24"/>
-          <w:lang w:val="es-ES"/>
-        </w:rPr>
-        <w:t>transformación</w:t>
-      </w:r>
-      <w:r>
-        <w:rPr>
-          <w:rFonts w:ascii="Arial" w:hAnsi="Arial" w:cs="Arial"/>
-          <w:sz w:val="24"/>
-          <w:szCs w:val="24"/>
-          <w:lang w:val="es-ES"/>
-        </w:rPr>
-        <w:t>, en donde buscamos la normalización de todos los datos, calculando los totales, la discriminación de impuestos y estructuras en registro de clientes, productos y las ventas.</w:t>
-      </w:r>
-    </w:p>
-    <w:p>
-      <w:pPr>
-        <w:jc w:val="both"/>
-        <w:rPr>
-          <w:rFonts w:ascii="Arial" w:hAnsi="Arial" w:cs="Arial"/>
-          <w:sz w:val="24"/>
-          <w:szCs w:val="24"/>
-          <w:lang w:val="es-ES"/>
-        </w:rPr>
-      </w:pPr>
-      <w:r>
-        <w:rPr>
-          <w:rFonts w:ascii="Arial" w:hAnsi="Arial" w:cs="Arial"/>
-          <w:sz w:val="24"/>
-          <w:szCs w:val="24"/>
-          <w:lang w:val="es-ES"/>
-        </w:rPr>
-        <w:t xml:space="preserve">Por </w:t>
-      </w:r>
-      <w:r>
-        <w:rPr>
-          <w:rFonts w:ascii="Arial" w:hAnsi="Arial" w:cs="Arial"/>
-          <w:sz w:val="24"/>
-          <w:szCs w:val="24"/>
-          <w:lang w:val="es-ES"/>
-        </w:rPr>
-        <w:t xml:space="preserve">último, </w:t>
-      </w:r>
-      <w:r>
-        <w:rPr>
-          <w:rFonts w:ascii="Arial" w:hAnsi="Arial" w:cs="Arial"/>
-          <w:b/>
-          <w:bCs/>
-          <w:sz w:val="24"/>
-          <w:szCs w:val="24"/>
-          <w:lang w:val="es-ES"/>
-        </w:rPr>
-        <w:t xml:space="preserve">la carga </w:t>
-      </w:r>
-      <w:r>
-        <w:rPr>
-          <w:rFonts w:ascii="Arial" w:hAnsi="Arial" w:cs="Arial"/>
-          <w:sz w:val="24"/>
-          <w:szCs w:val="24"/>
-          <w:lang w:val="es-ES"/>
-        </w:rPr>
-        <w:t>en donde</w:t>
-      </w:r>
-      <w:r>
-        <w:rPr>
-          <w:rFonts w:ascii="Arial" w:hAnsi="Arial" w:cs="Arial"/>
-          <w:sz w:val="24"/>
-          <w:szCs w:val="24"/>
-          <w:lang w:val="es-ES"/>
-        </w:rPr>
-        <w:t xml:space="preserve"> estaríamos consolidando los resultados parciales en una estructura unificada o en bases de datos relacionadas que estén centralizadas.</w:t>
-      </w:r>
-    </w:p>
-    <w:p>
-      <w:pPr>
-        <w:rPr>
-          <w:rFonts w:ascii="Arial" w:hAnsi="Arial" w:cs="Arial"/>
-          <w:b/>
-          <w:bCs/>
-          <w:sz w:val="24"/>
-          <w:szCs w:val="24"/>
-          <w:lang w:val="es-DO"/>
-        </w:rPr>
-      </w:pPr>
-    </w:p>
-    <w:p>
-      <w:pPr>
-        <w:pStyle w:val="Ttulo1"/>
+          <w:lang w:val="es-DO"/>
+        </w:rPr>
+        <w:t xml:space="preserve"> para medir con precisión el tiempo de ejecución de cada estrategia. A partir de esas mediciones, el sistema imprime métricas cuantitativas en consola, permitiendo comparar de forma objetiva el modo secuencial con el paralelo. Entre las métricas clave se incluyen el tiempo de ejecución en milisegundos, la aceleración (</w:t>
+      </w:r>
+      <w:proofErr w:type="spellStart"/>
+      <w:r>
+        <w:rPr>
+          <w:rFonts w:ascii="Arial" w:hAnsi="Arial" w:cs="Arial"/>
+          <w:i/>
+          <w:iCs/>
+          <w:sz w:val="24"/>
+          <w:szCs w:val="24"/>
+          <w:lang w:val="es-DO"/>
+        </w:rPr>
+        <w:t>speedup</w:t>
+      </w:r>
+      <w:proofErr w:type="spellEnd"/>
+      <w:r>
+        <w:rPr>
+          <w:rFonts w:ascii="Arial" w:hAnsi="Arial" w:cs="Arial"/>
+          <w:sz w:val="24"/>
+          <w:szCs w:val="24"/>
+          <w:lang w:val="es-DO"/>
+        </w:rPr>
+        <w:t>), y la eficiencia del sistema, que evalúa qué tan bien se aprovechan los recursos de procesamiento. Finalmente, se añade una validación de resultados que verifica automáticamente que la solución paralela produzca exactamente el mismo resultado computacional que la secuencial, asegurando consistencia y confiabilidad además de rendimiento.</w:t>
+      </w:r>
+    </w:p>
+    <w:p>
+      <w:pPr>
+        <w:rPr>
+          <w:rFonts w:ascii="Arial" w:hAnsi="Arial" w:cs="Arial"/>
+          <w:sz w:val="24"/>
+          <w:szCs w:val="24"/>
+          <w:lang w:val="es-DO"/>
+        </w:rPr>
+      </w:pPr>
+    </w:p>
+    <w:p>
+      <w:pPr>
+        <w:pStyle w:val="Heading2"/>
+        <w:rPr>
+          <w:rFonts w:ascii="Arial" w:hAnsi="Arial" w:cs="Arial"/>
+          <w:b/>
+          <w:bCs/>
+          <w:lang w:val="es-DO"/>
+        </w:rPr>
+      </w:pPr>
+      <w:bookmarkStart w:id="16" w:name="_Toc236761885"/>
+      <w:r>
         <w:rPr>
           <w:rFonts w:ascii="Arial" w:hAnsi="Arial" w:cs="Arial"/>
           <w:b/>
@@ -2412,222 +3885,72 @@
           <w:color w:val="auto"/>
           <w:sz w:val="24"/>
           <w:szCs w:val="24"/>
-        </w:rPr>
-      </w:pPr>
-      <w:bookmarkStart w:id="8" w:name="_Toc236754162"/>
-      <w:r>
-        <w:rPr>
-          <w:rFonts w:ascii="Arial" w:hAnsi="Arial" w:cs="Arial"/>
-          <w:b/>
-          <w:bCs/>
-          <w:color w:val="auto"/>
-          <w:sz w:val="24"/>
-          <w:szCs w:val="24"/>
-        </w:rPr>
-        <w:t>2.2 Aplicación del Problema en un Escenario Real</w:t>
-      </w:r>
-      <w:bookmarkEnd w:id="8"/>
-    </w:p>
-    <w:p>
-      <w:pPr>
-        <w:jc w:val="both"/>
-        <w:rPr>
-          <w:rFonts w:ascii="Arial" w:hAnsi="Arial" w:cs="Arial"/>
-          <w:sz w:val="24"/>
-          <w:szCs w:val="24"/>
-          <w:lang w:val="es-ES"/>
-        </w:rPr>
-      </w:pPr>
-      <w:r>
-        <w:rPr>
-          <w:rFonts w:ascii="Arial" w:hAnsi="Arial" w:cs="Arial"/>
-          <w:sz w:val="24"/>
-          <w:szCs w:val="24"/>
-          <w:lang w:val="es-ES"/>
-        </w:rPr>
-        <w:t xml:space="preserve">Este proyecto es fácilmente aplicable en escenarios de núcleo de los sistemas de inteligencia de negocios, consolas de procesamiento y motores analíticos de </w:t>
-      </w:r>
-      <w:proofErr w:type="spellStart"/>
-      <w:r>
-        <w:rPr>
-          <w:rFonts w:ascii="Arial" w:hAnsi="Arial" w:cs="Arial"/>
-          <w:sz w:val="24"/>
-          <w:szCs w:val="24"/>
-          <w:lang w:val="es-ES"/>
-        </w:rPr>
-        <w:t>retail</w:t>
-      </w:r>
-      <w:proofErr w:type="spellEnd"/>
-      <w:r>
-        <w:rPr>
-          <w:rFonts w:ascii="Arial" w:hAnsi="Arial" w:cs="Arial"/>
-          <w:sz w:val="24"/>
-          <w:szCs w:val="24"/>
-          <w:lang w:val="es-ES"/>
-        </w:rPr>
-        <w:t xml:space="preserve"> (Este básicamente es el </w:t>
-      </w:r>
-      <w:r>
-        <w:rPr>
-          <w:rFonts w:ascii="Arial" w:hAnsi="Arial" w:cs="Arial"/>
-          <w:sz w:val="24"/>
-          <w:szCs w:val="24"/>
-          <w:lang w:val="es-ES"/>
+          <w:lang w:val="es-DO"/>
+        </w:rPr>
+        <w:t>3.6 Aplicación a un Problema del Mundo Real</w:t>
+      </w:r>
+      <w:bookmarkEnd w:id="16"/>
+    </w:p>
+    <w:p>
+      <w:pPr>
+        <w:rPr>
+          <w:rFonts w:ascii="Arial" w:hAnsi="Arial" w:cs="Arial"/>
+          <w:sz w:val="24"/>
+          <w:szCs w:val="24"/>
+          <w:lang w:val="es-DO"/>
+        </w:rPr>
+      </w:pPr>
+      <w:r>
+        <w:rPr>
+          <w:rFonts w:ascii="Arial" w:hAnsi="Arial" w:cs="Arial"/>
+          <w:sz w:val="24"/>
+          <w:szCs w:val="24"/>
+          <w:lang w:val="es-DO"/>
+        </w:rPr>
+        <w:t xml:space="preserve">La aplicación se centra en resolver una problemática real vinculada al procesamiento masivo de datos transaccionales en cadenas comerciales, escenario típico de procesos ETL. Para afrontarlo, se aplican técnicas profesionales de desarrollo en C-Sharp, dentro del marco de la ingeniería de software paralela. Se contemplan estrategias de paralelización como el recorrido secuencial, la paralelización de alto nivel mediante constructores paralelos y balanceo </w:t>
+      </w:r>
+      <w:r>
+        <w:rPr>
+          <w:rFonts w:ascii="Arial" w:hAnsi="Arial" w:cs="Arial"/>
+          <w:sz w:val="24"/>
+          <w:szCs w:val="24"/>
+          <w:lang w:val="es-DO"/>
         </w:rPr>
         <w:lastRenderedPageBreak/>
-        <w:t>sector de comercios al por menor, que vende productos o servicios de manera directa, como los supermercados, las tiendas de ropa y las farmacias de medicamentos) o banca.</w:t>
-      </w:r>
-    </w:p>
-    <w:p>
-      <w:pPr>
-        <w:rPr>
-          <w:rFonts w:ascii="Arial" w:hAnsi="Arial" w:cs="Arial"/>
-          <w:sz w:val="24"/>
-          <w:szCs w:val="24"/>
-        </w:rPr>
-      </w:pPr>
-    </w:p>
-    <w:p>
-      <w:pPr>
-        <w:pStyle w:val="Ttulo1"/>
-        <w:jc w:val="both"/>
-        <w:rPr>
-          <w:rFonts w:ascii="Arial" w:hAnsi="Arial" w:cs="Arial"/>
-          <w:b/>
-          <w:bCs/>
-          <w:color w:val="auto"/>
-          <w:sz w:val="24"/>
-          <w:szCs w:val="24"/>
-        </w:rPr>
-      </w:pPr>
-      <w:r>
-        <w:rPr>
-          <w:rFonts w:ascii="Arial" w:hAnsi="Arial" w:cs="Arial"/>
-          <w:b/>
-          <w:bCs/>
-          <w:color w:val="auto"/>
-          <w:sz w:val="24"/>
-          <w:szCs w:val="24"/>
-        </w:rPr>
-        <w:t xml:space="preserve">2.3 Importancia del </w:t>
-      </w:r>
-      <w:proofErr w:type="spellStart"/>
-      <w:r>
-        <w:rPr>
-          <w:rFonts w:ascii="Arial" w:hAnsi="Arial" w:cs="Arial"/>
-          <w:b/>
-          <w:bCs/>
-          <w:color w:val="auto"/>
-          <w:sz w:val="24"/>
-          <w:szCs w:val="24"/>
-        </w:rPr>
-        <w:t>Paralelismo</w:t>
-      </w:r>
-      <w:proofErr w:type="spellEnd"/>
-      <w:r>
-        <w:rPr>
-          <w:rFonts w:ascii="Arial" w:hAnsi="Arial" w:cs="Arial"/>
-          <w:b/>
-          <w:bCs/>
-          <w:color w:val="auto"/>
-          <w:sz w:val="24"/>
-          <w:szCs w:val="24"/>
-        </w:rPr>
-        <w:t xml:space="preserve"> en la </w:t>
-      </w:r>
-      <w:proofErr w:type="spellStart"/>
-      <w:r>
-        <w:rPr>
-          <w:rFonts w:ascii="Arial" w:hAnsi="Arial" w:cs="Arial"/>
-          <w:b/>
-          <w:bCs/>
-          <w:color w:val="auto"/>
-          <w:sz w:val="24"/>
-          <w:szCs w:val="24"/>
-        </w:rPr>
-        <w:t>Solución</w:t>
-      </w:r>
-      <w:proofErr w:type="spellEnd"/>
-    </w:p>
-    <w:p>
-      <w:pPr>
-        <w:jc w:val="both"/>
-        <w:rPr>
-          <w:rFonts w:ascii="Arial" w:hAnsi="Arial" w:cs="Arial"/>
-          <w:sz w:val="24"/>
-          <w:szCs w:val="24"/>
-          <w:lang w:val="es-ES"/>
-        </w:rPr>
-      </w:pPr>
-      <w:r>
-        <w:rPr>
-          <w:rFonts w:ascii="Arial" w:hAnsi="Arial" w:cs="Arial"/>
-          <w:sz w:val="24"/>
-          <w:szCs w:val="24"/>
-          <w:lang w:val="es-ES"/>
-        </w:rPr>
-        <w:t>Para este proyecto, priorizamos que el procesamiento sea secuencial y se procese un lote a la vez en un solo hilo de ejecución, dejando inactivas las demás unidades del procesador, con el paradigma paralelo y utilizando la descomposición de datos.</w:t>
-      </w:r>
-    </w:p>
-    <w:p>
-      <w:pPr>
-        <w:jc w:val="both"/>
-        <w:rPr>
-          <w:rFonts w:ascii="Arial" w:hAnsi="Arial" w:cs="Arial"/>
-          <w:sz w:val="24"/>
-          <w:szCs w:val="24"/>
-          <w:lang w:val="es-ES"/>
-        </w:rPr>
-      </w:pPr>
-      <w:r>
-        <w:rPr>
-          <w:rFonts w:ascii="Arial" w:hAnsi="Arial" w:cs="Arial"/>
-          <w:sz w:val="24"/>
-          <w:szCs w:val="24"/>
-          <w:lang w:val="es-ES"/>
-        </w:rPr>
-        <w:t xml:space="preserve">Esto nos ayudará significativamente a que </w:t>
-      </w:r>
-      <w:r>
-        <w:rPr>
-          <w:rFonts w:ascii="Arial" w:hAnsi="Arial" w:cs="Arial"/>
-          <w:sz w:val="24"/>
-          <w:szCs w:val="24"/>
-          <w:lang w:val="es-ES"/>
-        </w:rPr>
-        <w:t>el conjunto global de las transacciones se divida</w:t>
-      </w:r>
-      <w:r>
-        <w:rPr>
-          <w:rFonts w:ascii="Arial" w:hAnsi="Arial" w:cs="Arial"/>
-          <w:sz w:val="24"/>
-          <w:szCs w:val="24"/>
-          <w:lang w:val="es-ES"/>
-        </w:rPr>
-        <w:t xml:space="preserve"> en </w:t>
-      </w:r>
-      <w:proofErr w:type="spellStart"/>
-      <w:r>
-        <w:rPr>
-          <w:rFonts w:ascii="Arial" w:hAnsi="Arial" w:cs="Arial"/>
-          <w:sz w:val="24"/>
-          <w:szCs w:val="24"/>
-          <w:lang w:val="es-ES"/>
-        </w:rPr>
-        <w:t>sub-bloques</w:t>
-      </w:r>
-      <w:proofErr w:type="spellEnd"/>
-      <w:r>
-        <w:rPr>
-          <w:rFonts w:ascii="Arial" w:hAnsi="Arial" w:cs="Arial"/>
-          <w:sz w:val="24"/>
-          <w:szCs w:val="24"/>
-          <w:lang w:val="es-ES"/>
-        </w:rPr>
-        <w:t xml:space="preserve"> de tamaño uniforme, y cada uno de los procesadores asuma la transformación de su bloque de forma independiente y simultánea, logrando así la reducción sustancial del tiempo de procesamiento que escala proporcionalmente con el número de procesadores físicos y lógicos disponible directamente en la máquina o computadora.</w:t>
-      </w:r>
-    </w:p>
-    <w:p/>
+        <w:t>automático de carga, el uso de tareas con particionamiento manual y el empleo de hilos nativos con transferencia explícita de estructuras de datos.</w:t>
+      </w:r>
+    </w:p>
+    <w:p>
+      <w:pPr>
+        <w:rPr>
+          <w:rFonts w:ascii="Arial" w:hAnsi="Arial" w:cs="Arial"/>
+          <w:sz w:val="24"/>
+          <w:szCs w:val="24"/>
+          <w:lang w:val="es-DO"/>
+        </w:rPr>
+      </w:pPr>
+    </w:p>
+    <w:p>
+      <w:pPr>
+        <w:rPr>
+          <w:lang w:val="es-DO"/>
+        </w:rPr>
+      </w:pPr>
+    </w:p>
+    <w:p>
+      <w:pPr>
+        <w:rPr>
+          <w:lang w:val="es-DO"/>
+        </w:rPr>
+      </w:pPr>
+    </w:p>
+    <w:p>
+      <w:pPr>
+        <w:rPr>
+          <w:lang w:val="es-DO"/>
+        </w:rPr>
+      </w:pPr>
+    </w:p>
     <w:sectPr>
       <w:pgSz w:w="12240" w:h="15840" w:code="1"/>
       <w:pgMar w:top="1440" w:right="1080" w:bottom="1440" w:left="1080" w:header="720" w:footer="720" w:gutter="0"/>
@@ -3349,11 +4672,11 @@
       <w14:ligatures w14:val="none"/>
     </w:rPr>
   </w:style>
-  <w:style w:type="paragraph" w:styleId="Ttulo1">
+  <w:style w:type="paragraph" w:styleId="Heading1">
     <w:name w:val="heading 1"/>
     <w:basedOn w:val="Normal"/>
     <w:next w:val="Normal"/>
-    <w:link w:val="Ttulo1Car"/>
+    <w:link w:val="Heading1Char"/>
     <w:uiPriority w:val="9"/>
     <w:qFormat/>
     <w:rsid w:val="00BC0815"/>
@@ -3370,11 +4693,11 @@
       <w:szCs w:val="40"/>
     </w:rPr>
   </w:style>
-  <w:style w:type="paragraph" w:styleId="Ttulo2">
+  <w:style w:type="paragraph" w:styleId="Heading2">
     <w:name w:val="heading 2"/>
     <w:basedOn w:val="Normal"/>
     <w:next w:val="Normal"/>
-    <w:link w:val="Ttulo2Car"/>
+    <w:link w:val="Heading2Char"/>
     <w:uiPriority w:val="9"/>
     <w:unhideWhenUsed/>
     <w:qFormat/>
@@ -3392,11 +4715,11 @@
       <w:szCs w:val="32"/>
     </w:rPr>
   </w:style>
-  <w:style w:type="paragraph" w:styleId="Ttulo3">
+  <w:style w:type="paragraph" w:styleId="Heading3">
     <w:name w:val="heading 3"/>
     <w:basedOn w:val="Normal"/>
     <w:next w:val="Normal"/>
-    <w:link w:val="Ttulo3Car"/>
+    <w:link w:val="Heading3Char"/>
     <w:uiPriority w:val="9"/>
     <w:unhideWhenUsed/>
     <w:qFormat/>
@@ -3414,11 +4737,11 @@
       <w:szCs w:val="28"/>
     </w:rPr>
   </w:style>
-  <w:style w:type="paragraph" w:styleId="Ttulo4">
+  <w:style w:type="paragraph" w:styleId="Heading4">
     <w:name w:val="heading 4"/>
     <w:basedOn w:val="Normal"/>
     <w:next w:val="Normal"/>
-    <w:link w:val="Ttulo4Car"/>
+    <w:link w:val="Heading4Char"/>
     <w:uiPriority w:val="9"/>
     <w:semiHidden/>
     <w:unhideWhenUsed/>
@@ -3437,11 +4760,11 @@
       <w:color w:val="0F4761" w:themeColor="accent1" w:themeShade="BF"/>
     </w:rPr>
   </w:style>
-  <w:style w:type="paragraph" w:styleId="Ttulo5">
+  <w:style w:type="paragraph" w:styleId="Heading5">
     <w:name w:val="heading 5"/>
     <w:basedOn w:val="Normal"/>
     <w:next w:val="Normal"/>
-    <w:link w:val="Ttulo5Car"/>
+    <w:link w:val="Heading5Char"/>
     <w:uiPriority w:val="9"/>
     <w:semiHidden/>
     <w:unhideWhenUsed/>
@@ -3458,11 +4781,11 @@
       <w:color w:val="0F4761" w:themeColor="accent1" w:themeShade="BF"/>
     </w:rPr>
   </w:style>
-  <w:style w:type="paragraph" w:styleId="Ttulo6">
+  <w:style w:type="paragraph" w:styleId="Heading6">
     <w:name w:val="heading 6"/>
     <w:basedOn w:val="Normal"/>
     <w:next w:val="Normal"/>
-    <w:link w:val="Ttulo6Car"/>
+    <w:link w:val="Heading6Char"/>
     <w:uiPriority w:val="9"/>
     <w:semiHidden/>
     <w:unhideWhenUsed/>
@@ -3481,11 +4804,11 @@
       <w:color w:val="595959" w:themeColor="text1" w:themeTint="A6"/>
     </w:rPr>
   </w:style>
-  <w:style w:type="paragraph" w:styleId="Ttulo7">
+  <w:style w:type="paragraph" w:styleId="Heading7">
     <w:name w:val="heading 7"/>
     <w:basedOn w:val="Normal"/>
     <w:next w:val="Normal"/>
-    <w:link w:val="Ttulo7Car"/>
+    <w:link w:val="Heading7Char"/>
     <w:uiPriority w:val="9"/>
     <w:semiHidden/>
     <w:unhideWhenUsed/>
@@ -3502,11 +4825,11 @@
       <w:color w:val="595959" w:themeColor="text1" w:themeTint="A6"/>
     </w:rPr>
   </w:style>
-  <w:style w:type="paragraph" w:styleId="Ttulo8">
+  <w:style w:type="paragraph" w:styleId="Heading8">
     <w:name w:val="heading 8"/>
     <w:basedOn w:val="Normal"/>
     <w:next w:val="Normal"/>
-    <w:link w:val="Ttulo8Car"/>
+    <w:link w:val="Heading8Char"/>
     <w:uiPriority w:val="9"/>
     <w:semiHidden/>
     <w:unhideWhenUsed/>
@@ -3525,11 +4848,11 @@
       <w:color w:val="272727" w:themeColor="text1" w:themeTint="D8"/>
     </w:rPr>
   </w:style>
-  <w:style w:type="paragraph" w:styleId="Ttulo9">
+  <w:style w:type="paragraph" w:styleId="Heading9">
     <w:name w:val="heading 9"/>
     <w:basedOn w:val="Normal"/>
     <w:next w:val="Normal"/>
-    <w:link w:val="Ttulo9Car"/>
+    <w:link w:val="Heading9Char"/>
     <w:uiPriority w:val="9"/>
     <w:semiHidden/>
     <w:unhideWhenUsed/>
@@ -3546,12 +4869,12 @@
       <w:color w:val="272727" w:themeColor="text1" w:themeTint="D8"/>
     </w:rPr>
   </w:style>
-  <w:style w:type="character" w:default="1" w:styleId="Fuentedeprrafopredeter">
+  <w:style w:type="character" w:default="1" w:styleId="DefaultParagraphFont">
     <w:name w:val="Default Paragraph Font"/>
     <w:uiPriority w:val="1"/>
     <w:unhideWhenUsed/>
   </w:style>
-  <w:style w:type="table" w:default="1" w:styleId="Tablanormal">
+  <w:style w:type="table" w:default="1" w:styleId="TableNormal">
     <w:name w:val="Normal Table"/>
     <w:uiPriority w:val="99"/>
     <w:semiHidden/>
@@ -3566,16 +4889,16 @@
       </w:tblCellMar>
     </w:tblPr>
   </w:style>
-  <w:style w:type="numbering" w:default="1" w:styleId="Sinlista">
+  <w:style w:type="numbering" w:default="1" w:styleId="NoList">
     <w:name w:val="No List"/>
     <w:uiPriority w:val="99"/>
     <w:semiHidden/>
     <w:unhideWhenUsed/>
   </w:style>
-  <w:style w:type="character" w:customStyle="1" w:styleId="Ttulo1Car">
-    <w:name w:val="Título 1 Car"/>
-    <w:basedOn w:val="Fuentedeprrafopredeter"/>
-    <w:link w:val="Ttulo1"/>
+  <w:style w:type="character" w:customStyle="1" w:styleId="Heading1Char">
+    <w:name w:val="Heading 1 Char"/>
+    <w:basedOn w:val="DefaultParagraphFont"/>
+    <w:link w:val="Heading1"/>
     <w:uiPriority w:val="9"/>
     <w:rsid w:val="00BC0815"/>
     <w:rPr>
@@ -3585,10 +4908,10 @@
       <w:szCs w:val="40"/>
     </w:rPr>
   </w:style>
-  <w:style w:type="character" w:customStyle="1" w:styleId="Ttulo2Car">
-    <w:name w:val="Título 2 Car"/>
-    <w:basedOn w:val="Fuentedeprrafopredeter"/>
-    <w:link w:val="Ttulo2"/>
+  <w:style w:type="character" w:customStyle="1" w:styleId="Heading2Char">
+    <w:name w:val="Heading 2 Char"/>
+    <w:basedOn w:val="DefaultParagraphFont"/>
+    <w:link w:val="Heading2"/>
     <w:uiPriority w:val="9"/>
     <w:rsid w:val="00BC0815"/>
     <w:rPr>
@@ -3598,10 +4921,10 @@
       <w:szCs w:val="32"/>
     </w:rPr>
   </w:style>
-  <w:style w:type="character" w:customStyle="1" w:styleId="Ttulo3Car">
-    <w:name w:val="Título 3 Car"/>
-    <w:basedOn w:val="Fuentedeprrafopredeter"/>
-    <w:link w:val="Ttulo3"/>
+  <w:style w:type="character" w:customStyle="1" w:styleId="Heading3Char">
+    <w:name w:val="Heading 3 Char"/>
+    <w:basedOn w:val="DefaultParagraphFont"/>
+    <w:link w:val="Heading3"/>
     <w:uiPriority w:val="9"/>
     <w:rsid w:val="00BC0815"/>
     <w:rPr>
@@ -3611,10 +4934,10 @@
       <w:szCs w:val="28"/>
     </w:rPr>
   </w:style>
-  <w:style w:type="character" w:customStyle="1" w:styleId="Ttulo4Car">
-    <w:name w:val="Título 4 Car"/>
-    <w:basedOn w:val="Fuentedeprrafopredeter"/>
-    <w:link w:val="Ttulo4"/>
+  <w:style w:type="character" w:customStyle="1" w:styleId="Heading4Char">
+    <w:name w:val="Heading 4 Char"/>
+    <w:basedOn w:val="DefaultParagraphFont"/>
+    <w:link w:val="Heading4"/>
     <w:uiPriority w:val="9"/>
     <w:semiHidden/>
     <w:rsid w:val="00BC0815"/>
@@ -3625,10 +4948,10 @@
       <w:color w:val="0F4761" w:themeColor="accent1" w:themeShade="BF"/>
     </w:rPr>
   </w:style>
-  <w:style w:type="character" w:customStyle="1" w:styleId="Ttulo5Car">
-    <w:name w:val="Título 5 Car"/>
-    <w:basedOn w:val="Fuentedeprrafopredeter"/>
-    <w:link w:val="Ttulo5"/>
+  <w:style w:type="character" w:customStyle="1" w:styleId="Heading5Char">
+    <w:name w:val="Heading 5 Char"/>
+    <w:basedOn w:val="DefaultParagraphFont"/>
+    <w:link w:val="Heading5"/>
     <w:uiPriority w:val="9"/>
     <w:semiHidden/>
     <w:rsid w:val="00BC0815"/>
@@ -3637,10 +4960,10 @@
       <w:color w:val="0F4761" w:themeColor="accent1" w:themeShade="BF"/>
     </w:rPr>
   </w:style>
-  <w:style w:type="character" w:customStyle="1" w:styleId="Ttulo6Car">
-    <w:name w:val="Título 6 Car"/>
-    <w:basedOn w:val="Fuentedeprrafopredeter"/>
-    <w:link w:val="Ttulo6"/>
+  <w:style w:type="character" w:customStyle="1" w:styleId="Heading6Char">
+    <w:name w:val="Heading 6 Char"/>
+    <w:basedOn w:val="DefaultParagraphFont"/>
+    <w:link w:val="Heading6"/>
     <w:uiPriority w:val="9"/>
     <w:semiHidden/>
     <w:rsid w:val="00BC0815"/>
@@ -3651,10 +4974,10 @@
       <w:color w:val="595959" w:themeColor="text1" w:themeTint="A6"/>
     </w:rPr>
   </w:style>
-  <w:style w:type="character" w:customStyle="1" w:styleId="Ttulo7Car">
-    <w:name w:val="Título 7 Car"/>
-    <w:basedOn w:val="Fuentedeprrafopredeter"/>
-    <w:link w:val="Ttulo7"/>
+  <w:style w:type="character" w:customStyle="1" w:styleId="Heading7Char">
+    <w:name w:val="Heading 7 Char"/>
+    <w:basedOn w:val="DefaultParagraphFont"/>
+    <w:link w:val="Heading7"/>
     <w:uiPriority w:val="9"/>
     <w:semiHidden/>
     <w:rsid w:val="00BC0815"/>
@@ -3663,10 +4986,10 @@
       <w:color w:val="595959" w:themeColor="text1" w:themeTint="A6"/>
     </w:rPr>
   </w:style>
-  <w:style w:type="character" w:customStyle="1" w:styleId="Ttulo8Car">
-    <w:name w:val="Título 8 Car"/>
-    <w:basedOn w:val="Fuentedeprrafopredeter"/>
-    <w:link w:val="Ttulo8"/>
+  <w:style w:type="character" w:customStyle="1" w:styleId="Heading8Char">
+    <w:name w:val="Heading 8 Char"/>
+    <w:basedOn w:val="DefaultParagraphFont"/>
+    <w:link w:val="Heading8"/>
     <w:uiPriority w:val="9"/>
     <w:semiHidden/>
     <w:rsid w:val="00BC0815"/>
@@ -3677,10 +5000,10 @@
       <w:color w:val="272727" w:themeColor="text1" w:themeTint="D8"/>
     </w:rPr>
   </w:style>
-  <w:style w:type="character" w:customStyle="1" w:styleId="Ttulo9Car">
-    <w:name w:val="Título 9 Car"/>
-    <w:basedOn w:val="Fuentedeprrafopredeter"/>
-    <w:link w:val="Ttulo9"/>
+  <w:style w:type="character" w:customStyle="1" w:styleId="Heading9Char">
+    <w:name w:val="Heading 9 Char"/>
+    <w:basedOn w:val="DefaultParagraphFont"/>
+    <w:link w:val="Heading9"/>
     <w:uiPriority w:val="9"/>
     <w:semiHidden/>
     <w:rsid w:val="00BC0815"/>
@@ -3689,11 +5012,11 @@
       <w:color w:val="272727" w:themeColor="text1" w:themeTint="D8"/>
     </w:rPr>
   </w:style>
-  <w:style w:type="paragraph" w:styleId="Ttulo">
+  <w:style w:type="paragraph" w:styleId="Title">
     <w:name w:val="Title"/>
     <w:basedOn w:val="Normal"/>
     <w:next w:val="Normal"/>
-    <w:link w:val="TtuloCar"/>
+    <w:link w:val="TitleChar"/>
     <w:uiPriority w:val="10"/>
     <w:qFormat/>
     <w:rsid w:val="00BC0815"/>
@@ -3709,10 +5032,10 @@
       <w:szCs w:val="56"/>
     </w:rPr>
   </w:style>
-  <w:style w:type="character" w:customStyle="1" w:styleId="TtuloCar">
-    <w:name w:val="Título Car"/>
-    <w:basedOn w:val="Fuentedeprrafopredeter"/>
-    <w:link w:val="Ttulo"/>
+  <w:style w:type="character" w:customStyle="1" w:styleId="TitleChar">
+    <w:name w:val="Title Char"/>
+    <w:basedOn w:val="DefaultParagraphFont"/>
+    <w:link w:val="Title"/>
     <w:uiPriority w:val="10"/>
     <w:rsid w:val="00BC0815"/>
     <w:rPr>
@@ -3723,11 +5046,11 @@
       <w:szCs w:val="56"/>
     </w:rPr>
   </w:style>
-  <w:style w:type="paragraph" w:styleId="Subttulo">
+  <w:style w:type="paragraph" w:styleId="Subtitle">
     <w:name w:val="Subtitle"/>
     <w:basedOn w:val="Normal"/>
     <w:next w:val="Normal"/>
-    <w:link w:val="SubttuloCar"/>
+    <w:link w:val="SubtitleChar"/>
     <w:uiPriority w:val="11"/>
     <w:qFormat/>
     <w:rsid w:val="00BC0815"/>
@@ -3744,10 +5067,10 @@
       <w:szCs w:val="28"/>
     </w:rPr>
   </w:style>
-  <w:style w:type="character" w:customStyle="1" w:styleId="SubttuloCar">
-    <w:name w:val="Subtítulo Car"/>
-    <w:basedOn w:val="Fuentedeprrafopredeter"/>
-    <w:link w:val="Subttulo"/>
+  <w:style w:type="character" w:customStyle="1" w:styleId="SubtitleChar">
+    <w:name w:val="Subtitle Char"/>
+    <w:basedOn w:val="DefaultParagraphFont"/>
+    <w:link w:val="Subtitle"/>
     <w:uiPriority w:val="11"/>
     <w:rsid w:val="00BC0815"/>
     <w:rPr>
@@ -3758,11 +5081,11 @@
       <w:szCs w:val="28"/>
     </w:rPr>
   </w:style>
-  <w:style w:type="paragraph" w:styleId="Cita">
+  <w:style w:type="paragraph" w:styleId="Quote">
     <w:name w:val="Quote"/>
     <w:basedOn w:val="Normal"/>
     <w:next w:val="Normal"/>
-    <w:link w:val="CitaCar"/>
+    <w:link w:val="QuoteChar"/>
     <w:uiPriority w:val="29"/>
     <w:qFormat/>
     <w:rsid w:val="00BC0815"/>
@@ -3776,10 +5099,10 @@
       <w:color w:val="404040" w:themeColor="text1" w:themeTint="BF"/>
     </w:rPr>
   </w:style>
-  <w:style w:type="character" w:customStyle="1" w:styleId="CitaCar">
-    <w:name w:val="Cita Car"/>
-    <w:basedOn w:val="Fuentedeprrafopredeter"/>
-    <w:link w:val="Cita"/>
+  <w:style w:type="character" w:customStyle="1" w:styleId="QuoteChar">
+    <w:name w:val="Quote Char"/>
+    <w:basedOn w:val="DefaultParagraphFont"/>
+    <w:link w:val="Quote"/>
     <w:uiPriority w:val="29"/>
     <w:rsid w:val="00BC0815"/>
     <w:rPr>
@@ -3788,7 +5111,7 @@
       <w:color w:val="404040" w:themeColor="text1" w:themeTint="BF"/>
     </w:rPr>
   </w:style>
-  <w:style w:type="paragraph" w:styleId="Prrafodelista">
+  <w:style w:type="paragraph" w:styleId="ListParagraph">
     <w:name w:val="List Paragraph"/>
     <w:basedOn w:val="Normal"/>
     <w:uiPriority w:val="34"/>
@@ -3799,9 +5122,9 @@
       <w:contextualSpacing/>
     </w:pPr>
   </w:style>
-  <w:style w:type="character" w:styleId="nfasisintenso">
+  <w:style w:type="character" w:styleId="IntenseEmphasis">
     <w:name w:val="Intense Emphasis"/>
-    <w:basedOn w:val="Fuentedeprrafopredeter"/>
+    <w:basedOn w:val="DefaultParagraphFont"/>
     <w:uiPriority w:val="21"/>
     <w:qFormat/>
     <w:rsid w:val="00BC0815"/>
@@ -3811,11 +5134,11 @@
       <w:color w:val="0F4761" w:themeColor="accent1" w:themeShade="BF"/>
     </w:rPr>
   </w:style>
-  <w:style w:type="paragraph" w:styleId="Citadestacada">
+  <w:style w:type="paragraph" w:styleId="IntenseQuote">
     <w:name w:val="Intense Quote"/>
     <w:basedOn w:val="Normal"/>
     <w:next w:val="Normal"/>
-    <w:link w:val="CitadestacadaCar"/>
+    <w:link w:val="IntenseQuoteChar"/>
     <w:uiPriority w:val="30"/>
     <w:qFormat/>
     <w:rsid w:val="00BC0815"/>
@@ -3834,10 +5157,10 @@
       <w:color w:val="0F4761" w:themeColor="accent1" w:themeShade="BF"/>
     </w:rPr>
   </w:style>
-  <w:style w:type="character" w:customStyle="1" w:styleId="CitadestacadaCar">
-    <w:name w:val="Cita destacada Car"/>
-    <w:basedOn w:val="Fuentedeprrafopredeter"/>
-    <w:link w:val="Citadestacada"/>
+  <w:style w:type="character" w:customStyle="1" w:styleId="IntenseQuoteChar">
+    <w:name w:val="Intense Quote Char"/>
+    <w:basedOn w:val="DefaultParagraphFont"/>
+    <w:link w:val="IntenseQuote"/>
     <w:uiPriority w:val="30"/>
     <w:rsid w:val="00BC0815"/>
     <w:rPr>
@@ -3846,9 +5169,9 @@
       <w:color w:val="0F4761" w:themeColor="accent1" w:themeShade="BF"/>
     </w:rPr>
   </w:style>
-  <w:style w:type="character" w:styleId="Referenciaintensa">
+  <w:style w:type="character" w:styleId="IntenseReference">
     <w:name w:val="Intense Reference"/>
-    <w:basedOn w:val="Fuentedeprrafopredeter"/>
+    <w:basedOn w:val="DefaultParagraphFont"/>
     <w:uiPriority w:val="32"/>
     <w:qFormat/>
     <w:rsid w:val="00BC0815"/>
@@ -3866,9 +5189,9 @@
     <w:uiPriority w:val="1"/>
     <w:rsid w:val="00F01A56"/>
   </w:style>
-  <w:style w:type="paragraph" w:styleId="TtuloTDC">
+  <w:style w:type="paragraph" w:styleId="TOCHeading">
     <w:name w:val="TOC Heading"/>
-    <w:basedOn w:val="Ttulo1"/>
+    <w:basedOn w:val="Heading1"/>
     <w:next w:val="Normal"/>
     <w:uiPriority w:val="39"/>
     <w:unhideWhenUsed/>
@@ -3883,7 +5206,7 @@
       <w:szCs w:val="32"/>
     </w:rPr>
   </w:style>
-  <w:style w:type="paragraph" w:styleId="TDC2">
+  <w:style w:type="paragraph" w:styleId="TOC2">
     <w:name w:val="toc 2"/>
     <w:basedOn w:val="Normal"/>
     <w:next w:val="Normal"/>
@@ -3896,7 +5219,7 @@
       <w:ind w:left="220"/>
     </w:pPr>
   </w:style>
-  <w:style w:type="paragraph" w:styleId="TDC3">
+  <w:style w:type="paragraph" w:styleId="TOC3">
     <w:name w:val="toc 3"/>
     <w:basedOn w:val="Normal"/>
     <w:next w:val="Normal"/>
@@ -3909,9 +5232,9 @@
       <w:ind w:left="440"/>
     </w:pPr>
   </w:style>
-  <w:style w:type="character" w:styleId="Hipervnculo">
+  <w:style w:type="character" w:styleId="Hyperlink">
     <w:name w:val="Hyperlink"/>
-    <w:basedOn w:val="Fuentedeprrafopredeter"/>
+    <w:basedOn w:val="DefaultParagraphFont"/>
     <w:uiPriority w:val="99"/>
     <w:unhideWhenUsed/>
     <w:rsid w:val="00D51796"/>
@@ -3920,7 +5243,7 @@
       <w:u w:val="single"/>
     </w:rPr>
   </w:style>
-  <w:style w:type="paragraph" w:styleId="TDC1">
+  <w:style w:type="paragraph" w:styleId="TOC1">
     <w:name w:val="toc 1"/>
     <w:basedOn w:val="Normal"/>
     <w:next w:val="Normal"/>

</xml_diff>